<commit_message>
Add valuation engine, dynamic #1 value killer diagnosis, peer benchmarks, and EPI landing copy
</commit_message>
<xml_diff>
--- a/Business_Sellability_Assessment_Master_Architecture.docx
+++ b/Business_Sellability_Assessment_Master_Architecture.docx
@@ -15,7 +15,7 @@
         </w:rPr>
         <w:t>GARY ASHWORTH</w:t>
         <w:br/>
-        <w:t>BUSINESS SELLABILITY ASSESSMENT TOOL</w:t>
+        <w:t>BUSINESS SELLABILITY DIAGNOSTIC</w:t>
       </w:r>
     </w:p>
     <w:p>
@@ -29,7 +29,7 @@
           <w:color w:val="2ABAD2"/>
           <w:sz w:val="26"/>
         </w:rPr>
-        <w:t>Master Architecture, Question Flow, Scoring Engine &amp; Outcome Specification</w:t>
+        <w:t>Valuation Multiplier Engine, #1 Value Killer Diagnosis &amp; Master Specification</w:t>
       </w:r>
     </w:p>
     <w:p/>
@@ -48,15 +48,72 @@
         <w:t>1. Landing Page &amp; Lead Capture Copy</w:t>
       </w:r>
     </w:p>
+    <w:tbl>
+      <w:tblPr>
+        <w:tblW w:type="auto" w:w="0"/>
+        <w:jc w:val="center"/>
+        <w:tblLook w:firstColumn="1" w:firstRow="1" w:lastColumn="0" w:lastRow="0" w:noHBand="0" w:noVBand="1" w:val="04A0"/>
+      </w:tblPr>
+      <w:tblGrid>
+        <w:gridCol w:w="9360"/>
+      </w:tblGrid>
+      <w:tr>
+        <w:tc>
+          <w:tcPr>
+            <w:tcW w:type="dxa" w:w="9360"/>
+            <w:shd w:fill="FEF2F2"/>
+            <w:tcBorders>
+              <w:top w:val="none"/>
+              <w:left w:val="single" w:sz="24" w:space="0" w:color="DC2626"/>
+              <w:bottom w:val="none"/>
+              <w:right w:val="none"/>
+            </w:tcBorders>
+          </w:tcPr>
+          <w:p>
+            <w:pPr>
+              <w:spacing w:before="80" w:after="80"/>
+            </w:pPr>
+            <w:r>
+              <w:rPr>
+                <w:b/>
+                <w:color w:val="0F172A"/>
+                <w:sz w:val="22"/>
+              </w:rPr>
+              <w:t>⚠️ Hard Exit Statistic Banner:</w:t>
+              <w:br/>
+            </w:r>
+            <w:r>
+              <w:rPr>
+                <w:color w:val="0F172A"/>
+                <w:sz w:val="21"/>
+              </w:rPr>
+              <w:t>Fact: 70% to 80% of businesses prepared for sale NEVER actually sell. (Exit Planning Institute)</w:t>
+            </w:r>
+          </w:p>
+        </w:tc>
+      </w:tr>
+    </w:tbl>
+    <w:p/>
     <w:p>
       <w:r>
         <w:rPr>
           <w:b/>
         </w:rPr>
-        <w:t xml:space="preserve">Header Branding Pill: </w:t>
-      </w:r>
-      <w:r>
-        <w:t>• GARY ASHWORTH • YOUR BUSINESS SELLABILITY ASSESSMENT</w:t>
+        <w:t xml:space="preserve">Main Headline: </w:t>
+      </w:r>
+      <w:r>
+        <w:t>Would Anyone Really Want to Buy Your Business? And If They Do, What Is It Actually Worth?</w:t>
+      </w:r>
+    </w:p>
+    <w:p>
+      <w:r>
+        <w:rPr>
+          <w:b/>
+        </w:rPr>
+        <w:t xml:space="preserve">Main Subtitle: </w:t>
+      </w:r>
+      <w:r>
+        <w:t>Take my 3-minute executive diagnostic to calculate your estimated £ valuation, discover your multiple tier, and pinpoint your #1 value killer before buyers do.</w:t>
       </w:r>
     </w:p>
     <w:p>
@@ -68,28 +125,6 @@
       </w:r>
       <w:r>
         <w:t>⏱️ Takes just 2–3 minutes to complete</w:t>
-      </w:r>
-    </w:p>
-    <w:p>
-      <w:r>
-        <w:rPr>
-          <w:b/>
-        </w:rPr>
-        <w:t xml:space="preserve">Main Headline: </w:t>
-      </w:r>
-      <w:r>
-        <w:t>Is Your Business Transferable &amp; Ready to Sell at a Premium Multiple?</w:t>
-      </w:r>
-    </w:p>
-    <w:p>
-      <w:r>
-        <w:rPr>
-          <w:b/>
-        </w:rPr>
-        <w:t xml:space="preserve">Main Subtitle: </w:t>
-      </w:r>
-      <w:r>
-        <w:t>Discover your custom exit readiness score, identify hidden buyer risks, and receive a transformational roadmap to maximize your enterprise value.</w:t>
       </w:r>
     </w:p>
     <w:p>
@@ -126,10 +161,10 @@
         <w:rPr>
           <w:b/>
         </w:rPr>
-        <w:t xml:space="preserve">Your Sellability Score (1–100): </w:t>
-      </w:r>
-      <w:r>
-        <w:t>Discover your exact exit readiness score and how acquirers value your business today.</w:t>
+        <w:t xml:space="preserve">Your £ Valuation &amp; Multiple: </w:t>
+      </w:r>
+      <w:r>
+        <w:t>Discover what buyers would realistically pay today versus what a tier-90 business commands.</w:t>
       </w:r>
     </w:p>
     <w:p>
@@ -140,10 +175,10 @@
         <w:rPr>
           <w:b/>
         </w:rPr>
-        <w:t xml:space="preserve">Practical Recommendations: </w:t>
-      </w:r>
-      <w:r>
-        <w:t>Receive custom, actionable tips to eliminate owner reliance and boost sellability.</w:t>
+        <w:t xml:space="preserve">Your #1 Value Killer Diagnosed: </w:t>
+      </w:r>
+      <w:r>
+        <w:t>Pinpoint the exact single operational, founder, or concentration risk destroying your exit price.</w:t>
       </w:r>
     </w:p>
     <w:p>
@@ -154,10 +189,10 @@
         <w:rPr>
           <w:b/>
         </w:rPr>
-        <w:t xml:space="preserve">Transformational Growth: </w:t>
-      </w:r>
-      <w:r>
-        <w:t>Unlock a clear blueprint to turn your business into a high-multiple, self-sustaining exit asset.</w:t>
+        <w:t xml:space="preserve">The Valuation Gap Blueprint: </w:t>
+      </w:r>
+      <w:r>
+        <w:t>Calculate the exact £ money left on the table and unlock a roadmap to capture it.</w:t>
       </w:r>
     </w:p>
     <w:p>
@@ -214,7 +249,7 @@
         <w:t xml:space="preserve">Primary CTA Button: </w:t>
       </w:r>
       <w:r>
-        <w:t>Begin Your Business Sellability Assessment →</w:t>
+        <w:t>Begin Your Business Sellability Diagnostic →</w:t>
       </w:r>
     </w:p>
     <w:p>
@@ -268,7 +303,7 @@
           <w:i/>
           <w:color w:val="64748B"/>
         </w:rPr>
-        <w:t>Subtitle / Context: Higher revenue provides your business with a stronger valuation foundation and higher buyer interest.</w:t>
+        <w:t>Subtitle / Context: Revenue scale establishes your baseline valuation tier and determines which buyer pools will compete for your asset.</w:t>
       </w:r>
     </w:p>
     <w:p>
@@ -279,10 +314,10 @@
         <w:rPr>
           <w:b/>
         </w:rPr>
-        <w:t xml:space="preserve">Under $1 Million </w:t>
-      </w:r>
-      <w:r>
-        <w:t>(5 pts)</w:t>
+        <w:t xml:space="preserve">Under £1 Million </w:t>
+      </w:r>
+      <w:r>
+        <w:t>(5 pts - Est. £650k)</w:t>
       </w:r>
     </w:p>
     <w:p>
@@ -293,10 +328,10 @@
         <w:rPr>
           <w:b/>
         </w:rPr>
-        <w:t xml:space="preserve">$1 Million to $3 Million </w:t>
-      </w:r>
-      <w:r>
-        <w:t>(10 pts)</w:t>
+        <w:t xml:space="preserve">£1 Million to £3 Million </w:t>
+      </w:r>
+      <w:r>
+        <w:t>(10 pts - Est. £2.0M)</w:t>
       </w:r>
     </w:p>
     <w:p>
@@ -307,10 +342,10 @@
         <w:rPr>
           <w:b/>
         </w:rPr>
-        <w:t xml:space="preserve">$3 Million to $10 Million </w:t>
-      </w:r>
-      <w:r>
-        <w:t>(15 pts)</w:t>
+        <w:t xml:space="preserve">£3 Million to £10 Million </w:t>
+      </w:r>
+      <w:r>
+        <w:t>(15 pts - Est. £6.0M)</w:t>
       </w:r>
     </w:p>
     <w:p>
@@ -321,10 +356,10 @@
         <w:rPr>
           <w:b/>
         </w:rPr>
-        <w:t xml:space="preserve">Over $10 Million </w:t>
-      </w:r>
-      <w:r>
-        <w:t>(20 pts)</w:t>
+        <w:t xml:space="preserve">Over £10 Million </w:t>
+      </w:r>
+      <w:r>
+        <w:t>(20 pts - Est. £15.0M)</w:t>
       </w:r>
     </w:p>
     <w:p>
@@ -348,7 +383,7 @@
           <w:i/>
           <w:color w:val="64748B"/>
         </w:rPr>
-        <w:t>Subtitle / Context: Healthy net margins demonstrate your operational efficiency and cash flow reliability.</w:t>
+        <w:t>Subtitle / Context: Healthy net margins demonstrate operational efficiency and generate the transferable EBITDA buyers actually pay for.</w:t>
       </w:r>
     </w:p>
     <w:p>
@@ -362,7 +397,7 @@
         <w:t xml:space="preserve">Negative or Breakeven </w:t>
       </w:r>
       <w:r>
-        <w:t>(0 pts - Triggers Conditional Q2B)</w:t>
+        <w:t>(0 pts - Triggers Conditional Q2B (Est. 3%))</w:t>
       </w:r>
     </w:p>
     <w:p>
@@ -376,7 +411,7 @@
         <w:t xml:space="preserve">1% to 10% </w:t>
       </w:r>
       <w:r>
-        <w:t>(5 pts)</w:t>
+        <w:t>(5 pts - Est. 7.5%)</w:t>
       </w:r>
     </w:p>
     <w:p>
@@ -390,7 +425,7 @@
         <w:t xml:space="preserve">11% to 20% </w:t>
       </w:r>
       <w:r>
-        <w:t>(10 pts)</w:t>
+        <w:t>(10 pts - Est. 15%)</w:t>
       </w:r>
     </w:p>
     <w:p>
@@ -404,7 +439,7 @@
         <w:t xml:space="preserve">Over 20% </w:t>
       </w:r>
       <w:r>
-        <w:t>(15 pts)</w:t>
+        <w:t>(15 pts - Est. 25%)</w:t>
       </w:r>
     </w:p>
     <w:p>
@@ -428,7 +463,7 @@
           <w:i/>
           <w:color w:val="64748B"/>
         </w:rPr>
-        <w:t>Subtitle / Context: Differentiating growth investment from systemic weakness helps assess your true business valuation potential.</w:t>
+        <w:t>Subtitle / Context: Differentiating deliberate growth investment from systemic weakness determines whether buyers see upside or operational risk.</w:t>
       </w:r>
     </w:p>
     <w:p>
@@ -508,7 +543,7 @@
           <w:i/>
           <w:color w:val="64748B"/>
         </w:rPr>
-        <w:t>Subtitle / Context: Your growth rate signals market trajectory and future expansion potential to prospective buyers.</w:t>
+        <w:t>Subtitle / Context: Growth trajectory is the ultimate multiplier. Acquirers severely discount or walk away from contracting businesses.</w:t>
       </w:r>
     </w:p>
     <w:p>
@@ -649,7 +684,7 @@
           <w:i/>
           <w:color w:val="64748B"/>
         </w:rPr>
-        <w:t>Subtitle / Context: The more daily operations depend directly on you, the harder it is for a buyer to step in and take over.</w:t>
+        <w:t>Subtitle / Context: The more daily operations depend directly on you, the harder it is for a buyer to step in without you.</w:t>
       </w:r>
     </w:p>
     <w:p>
@@ -729,7 +764,7 @@
           <w:i/>
           <w:color w:val="64748B"/>
         </w:rPr>
-        <w:t>Subtitle / Context: Tests how dependent your revenue engine is on your personal relationships and presence.</w:t>
+        <w:t>Subtitle / Context: Tests whether your revenue engine is an institutional machine or a personal rolodex.</w:t>
       </w:r>
     </w:p>
     <w:p>
@@ -827,7 +862,7 @@
                 <w:color w:val="0F172A"/>
                 <w:sz w:val="21"/>
               </w:rPr>
-              <w:t>Selecting Sales drop to zero triggers the Institutional Buyer Flag. This business is marked as highly difficult to sell to institutional buyers/private equity without major operational delegation.</w:t>
+              <w:t>Selecting Sales drop to zero triggers the Institutional Buyer Flag. Marked as non-transferable without an autonomous sales engine.</w:t>
             </w:r>
           </w:p>
         </w:tc>
@@ -855,7 +890,7 @@
           <w:i/>
           <w:color w:val="64748B"/>
         </w:rPr>
-        <w:t>Subtitle / Context: Having a leader run operations without you dramatically increases your business's transferable value.</w:t>
+        <w:t>Subtitle / Context: A proven management team transforms your business from a founder-dependent job into a high-multiple asset.</w:t>
       </w:r>
     </w:p>
     <w:p>
@@ -950,7 +985,7 @@
           <w:i/>
           <w:color w:val="64748B"/>
         </w:rPr>
-        <w:t>Subtitle / Context: High customer concentration poses a major risk to your business if your top account leaves.</w:t>
+        <w:t>Subtitle / Context: High customer concentration is the #1 deal-killer during acquirer financing and due diligence.</w:t>
       </w:r>
     </w:p>
     <w:p>
@@ -1030,7 +1065,7 @@
           <w:i/>
           <w:color w:val="64748B"/>
         </w:rPr>
-        <w:t>Subtitle / Context: Contractual terms determine how securely your concentrated revenue is protected.</w:t>
+        <w:t>Subtitle / Context: Contractual terms determine how securely your concentrated cash flow is protected.</w:t>
       </w:r>
     </w:p>
     <w:p>
@@ -1110,7 +1145,7 @@
           <w:i/>
           <w:color w:val="64748B"/>
         </w:rPr>
-        <w:t>Subtitle / Context: Single point of failure suppliers can derail your exit due diligence.</w:t>
+        <w:t>Subtitle / Context: Single-point-of-failure suppliers create operational fragility that buyers discount.</w:t>
       </w:r>
     </w:p>
     <w:p>
@@ -1190,7 +1225,7 @@
           <w:i/>
           <w:color w:val="64748B"/>
         </w:rPr>
-        <w:t>Subtitle / Context: Measures how dependent your revenue is on key staff versus your internal sales systems.</w:t>
+        <w:t>Subtitle / Context: Measures whether your sales system belongs to the business or resides in an individual's head.</w:t>
       </w:r>
     </w:p>
     <w:p>
@@ -1285,7 +1320,7 @@
           <w:i/>
           <w:color w:val="64748B"/>
         </w:rPr>
-        <w:t>Subtitle / Context: Predictable recurring revenue commands the highest buyer valuation multiples.</w:t>
+        <w:t>Subtitle / Context: Predictable, guaranteed future cash flow commands the highest valuation multiples in the M&amp;A market.</w:t>
       </w:r>
     </w:p>
     <w:p>
@@ -1383,7 +1418,7 @@
                 <w:color w:val="0F172A"/>
                 <w:sz w:val="21"/>
               </w:rPr>
-              <w:t>Selecting Over 50% applies a 1.15x Multiplier to your total running score! Buyers pay top valuation premiums for guaranteed future cash flow.</w:t>
+              <w:t>Selecting Over 50% applies a 1.15x Multiplier to your total running score! Buyers pay top valuation premiums for contracted future cash flow.</w:t>
             </w:r>
           </w:p>
         </w:tc>
@@ -1411,7 +1446,7 @@
           <w:i/>
           <w:color w:val="64748B"/>
         </w:rPr>
-        <w:t>Subtitle / Context: Tests your pricing power and how indispensable your offer is to your customers.</w:t>
+        <w:t>Subtitle / Context: Pricing power demonstrates customer retention, brand defensibility, and competitive moat.</w:t>
       </w:r>
     </w:p>
     <w:p>
@@ -1491,7 +1526,7 @@
           <w:i/>
           <w:color w:val="64748B"/>
         </w:rPr>
-        <w:t>Subtitle / Context: High gross margins reflect your pricing leverage and competitive moat.</w:t>
+        <w:t>Subtitle / Context: Superior gross margins prove pricing leverage and protect profits during economic contractions.</w:t>
       </w:r>
     </w:p>
     <w:p>
@@ -1571,7 +1606,7 @@
           <w:i/>
           <w:color w:val="64748B"/>
         </w:rPr>
-        <w:t>Subtitle / Context: Upfront customer payments eliminate cash flow stress and boost your business valuation.</w:t>
+        <w:t>Subtitle / Context: Negative working capital cycles eliminate buyer debt burden and drastically increase enterprise value.</w:t>
       </w:r>
     </w:p>
     <w:p>
@@ -1651,7 +1686,7 @@
           <w:i/>
           <w:color w:val="64748B"/>
         </w:rPr>
-        <w:t>Subtitle / Context: Customer loyalty indicates your brand equity and organic word-of-mouth strength.</w:t>
+        <w:t>Subtitle / Context: Customer loyalty indicates organic word-of-mouth momentum and lowers customer acquisition costs for acquirers.</w:t>
       </w:r>
     </w:p>
     <w:p>
@@ -1731,7 +1766,7 @@
           <w:i/>
           <w:color w:val="64748B"/>
         </w:rPr>
-        <w:t>Subtitle / Context: Clean financial records protect your valuation and ensure a smooth exit process.</w:t>
+        <w:t>Subtitle / Context: Clean, verified financial records shorten diligence timelines and prevent buyers from chipping away at your price.</w:t>
       </w:r>
     </w:p>
     <w:p>
@@ -1802,7 +1837,730 @@
           <w:color w:val="2ABAD2"/>
           <w:sz w:val="32"/>
         </w:rPr>
-        <w:t>3. Scoring Engine Mathematics</w:t>
+        <w:t>3. Valuation Multiplier &amp; Gap Engine</w:t>
+      </w:r>
+    </w:p>
+    <w:tbl>
+      <w:tblPr>
+        <w:tblW w:type="auto" w:w="0"/>
+        <w:jc w:val="center"/>
+        <w:tblLook w:firstColumn="1" w:firstRow="1" w:lastColumn="0" w:lastRow="0" w:noHBand="0" w:noVBand="1" w:val="04A0"/>
+      </w:tblPr>
+      <w:tblGrid>
+        <w:gridCol w:w="9360"/>
+      </w:tblGrid>
+      <w:tr>
+        <w:tc>
+          <w:tcPr>
+            <w:tcW w:type="dxa" w:w="9360"/>
+            <w:shd w:fill="F0FDFA"/>
+            <w:tcBorders>
+              <w:top w:val="none"/>
+              <w:left w:val="single" w:sz="24" w:space="0" w:color="2ABAD2"/>
+              <w:bottom w:val="none"/>
+              <w:right w:val="none"/>
+            </w:tcBorders>
+          </w:tcPr>
+          <w:p>
+            <w:pPr>
+              <w:spacing w:before="80" w:after="80"/>
+            </w:pPr>
+            <w:r>
+              <w:rPr>
+                <w:b/>
+                <w:color w:val="0F172A"/>
+                <w:sz w:val="22"/>
+              </w:rPr>
+              <w:t>Valuation Calculation Model:</w:t>
+              <w:br/>
+            </w:r>
+            <w:r>
+              <w:rPr>
+                <w:color w:val="0F172A"/>
+                <w:sz w:val="21"/>
+              </w:rPr>
+              <w:t>• Baseline EBITDA = Revenue Estimate (Q1) × Net Margin Estimate (Q2)</w:t>
+              <w:br/>
+              <w:t>• Current Multiple Tiers:</w:t>
+              <w:br/>
+              <w:t xml:space="preserve">   - Score 0–50: ~2.0x EBITDA (Owner-Dependent Job)</w:t>
+              <w:br/>
+              <w:t xml:space="preserve">   - Score 51–70: ~3.8x EBITDA (Sellable with Discounts)</w:t>
+              <w:br/>
+              <w:t xml:space="preserve">   - Score 71–89: ~5.8x EBITDA (Marketable Asset)</w:t>
+              <w:br/>
+              <w:t xml:space="preserve">   - Score 90–100: ~8.5x EBITDA (Premium Exit Asset)</w:t>
+              <w:br/>
+              <w:t>• Estimated Current Valuation = Baseline EBITDA × Current Multiple</w:t>
+              <w:br/>
+              <w:t>• Tier-90+ Exit Potential = Baseline EBITDA × 8.5x Multiple</w:t>
+              <w:br/>
+              <w:t>• The Valuation Gap = Potential Valuation − Current Valuation (Money left on the table)</w:t>
+            </w:r>
+          </w:p>
+        </w:tc>
+      </w:tr>
+    </w:tbl>
+    <w:p/>
+    <w:p>
+      <w:pPr>
+        <w:keepNext/>
+        <w:spacing w:before="360" w:after="160"/>
+      </w:pPr>
+      <w:r>
+        <w:rPr>
+          <w:rFonts w:ascii="Arial" w:hAnsi="Arial"/>
+          <w:b/>
+          <w:color w:val="2ABAD2"/>
+          <w:sz w:val="32"/>
+        </w:rPr>
+        <w:t>4. Dynamic #1 Value Killer Diagnostics</w:t>
+      </w:r>
+    </w:p>
+    <w:p>
+      <w:pPr>
+        <w:keepNext/>
+        <w:spacing w:before="280" w:after="120"/>
+      </w:pPr>
+      <w:r>
+        <w:rPr>
+          <w:rFonts w:ascii="Arial" w:hAnsi="Arial"/>
+          <w:b/>
+          <w:color w:val="0F172A"/>
+          <w:sz w:val="26"/>
+        </w:rPr>
+        <w:t>1. Founder Trap (Severe Key-Person Risk)</w:t>
+      </w:r>
+    </w:p>
+    <w:p>
+      <w:r>
+        <w:rPr>
+          <w:b/>
+        </w:rPr>
+        <w:t xml:space="preserve">Trigger: </w:t>
+      </w:r>
+      <w:r>
+        <w:t>Q5 = Sales drop to zero if owner leaves for 3 months</w:t>
+      </w:r>
+    </w:p>
+    <w:p>
+      <w:r>
+        <w:rPr>
+          <w:b/>
+        </w:rPr>
+        <w:t xml:space="preserve">Valuation Impact: </w:t>
+      </w:r>
+      <w:r>
+        <w:t>Cuts EBITDA multiple by up to 50% &amp; triggers grueling 3–5 year earnouts</w:t>
+      </w:r>
+    </w:p>
+    <w:p>
+      <w:r>
+        <w:rPr>
+          <w:b/>
+        </w:rPr>
+        <w:t xml:space="preserve">Diagnosis: </w:t>
+      </w:r>
+      <w:r>
+        <w:t>Sales drop to zero if you step away. In M&amp;A, buyers do not buy jobs — they buy self-sustaining cash flow engines. Institutional buyers will pass immediately or demand a multi-year earnout tied to your personal presence.</w:t>
+      </w:r>
+    </w:p>
+    <w:p>
+      <w:r>
+        <w:rPr>
+          <w:b/>
+        </w:rPr>
+        <w:t xml:space="preserve">Tactical Remedy: </w:t>
+      </w:r>
+      <w:r>
+        <w:t>Immediately build documented SOPs and install a second-in-command who owns customer fulfillment and sales pipelines.</w:t>
+      </w:r>
+    </w:p>
+    <w:p/>
+    <w:p>
+      <w:pPr>
+        <w:keepNext/>
+        <w:spacing w:before="280" w:after="120"/>
+      </w:pPr>
+      <w:r>
+        <w:rPr>
+          <w:rFonts w:ascii="Arial" w:hAnsi="Arial"/>
+          <w:b/>
+          <w:color w:val="0F172A"/>
+          <w:sz w:val="26"/>
+        </w:rPr>
+        <w:t>2. Severe Customer Concentration (&gt;30% Revenue)</w:t>
+      </w:r>
+    </w:p>
+    <w:p>
+      <w:r>
+        <w:rPr>
+          <w:b/>
+        </w:rPr>
+        <w:t xml:space="preserve">Trigger: </w:t>
+      </w:r>
+      <w:r>
+        <w:t>Q7 = Over 30% of revenue in single largest account</w:t>
+      </w:r>
+    </w:p>
+    <w:p>
+      <w:r>
+        <w:rPr>
+          <w:b/>
+        </w:rPr>
+        <w:t xml:space="preserve">Valuation Impact: </w:t>
+      </w:r>
+      <w:r>
+        <w:t>Triggers 2.0x–3.0x multiple penalty and bank acquisition financing refusal</w:t>
+      </w:r>
+    </w:p>
+    <w:p>
+      <w:r>
+        <w:rPr>
+          <w:b/>
+        </w:rPr>
+        <w:t xml:space="preserve">Diagnosis: </w:t>
+      </w:r>
+      <w:r>
+        <w:t>A single client generates over 30% of turnover. If that customer churns post-sale, the buyer's debt service collapses. Bank lenders often refuse to finance acquisitions with over 25% single-customer exposure.</w:t>
+      </w:r>
+    </w:p>
+    <w:p>
+      <w:r>
+        <w:rPr>
+          <w:b/>
+        </w:rPr>
+        <w:t xml:space="preserve">Tactical Remedy: </w:t>
+      </w:r>
+      <w:r>
+        <w:t>Lock this major customer into a multi-year SLA and execute a targeted sales sprint to dilute their share below 15%.</w:t>
+      </w:r>
+    </w:p>
+    <w:p/>
+    <w:p>
+      <w:pPr>
+        <w:keepNext/>
+        <w:spacing w:before="280" w:after="120"/>
+      </w:pPr>
+      <w:r>
+        <w:rPr>
+          <w:rFonts w:ascii="Arial" w:hAnsi="Arial"/>
+          <w:b/>
+          <w:color w:val="0F172A"/>
+          <w:sz w:val="26"/>
+        </w:rPr>
+        <w:t>3. Contracting Revenue Trajectory</w:t>
+      </w:r>
+    </w:p>
+    <w:p>
+      <w:r>
+        <w:rPr>
+          <w:b/>
+        </w:rPr>
+        <w:t xml:space="preserve">Trigger: </w:t>
+      </w:r>
+      <w:r>
+        <w:t>Q3 = Declining YoY growth</w:t>
+      </w:r>
+    </w:p>
+    <w:p>
+      <w:r>
+        <w:rPr>
+          <w:b/>
+        </w:rPr>
+        <w:t xml:space="preserve">Valuation Impact: </w:t>
+      </w:r>
+      <w:r>
+        <w:t>Hard score cap at 70/100 &amp; heavy distressed acquisition discounts</w:t>
+      </w:r>
+    </w:p>
+    <w:p>
+      <w:r>
+        <w:rPr>
+          <w:b/>
+        </w:rPr>
+        <w:t xml:space="preserve">Diagnosis: </w:t>
+      </w:r>
+      <w:r>
+        <w:t>Your top-line revenue is shrinking year-over-year. Buyers purchase future cash flow, not historical nostalgia. A declining business is treated as a turnaround risk, slashing multiples.</w:t>
+      </w:r>
+    </w:p>
+    <w:p>
+      <w:r>
+        <w:rPr>
+          <w:b/>
+        </w:rPr>
+        <w:t xml:space="preserve">Tactical Remedy: </w:t>
+      </w:r>
+      <w:r>
+        <w:t>Eliminate low-margin product lines, restructure pricing, and establish 2 consecutive quarters of growth stabilization before going to market.</w:t>
+      </w:r>
+    </w:p>
+    <w:p/>
+    <w:p>
+      <w:pPr>
+        <w:keepNext/>
+        <w:spacing w:before="360" w:after="160"/>
+      </w:pPr>
+      <w:r>
+        <w:rPr>
+          <w:rFonts w:ascii="Arial" w:hAnsi="Arial"/>
+          <w:b/>
+          <w:color w:val="2ABAD2"/>
+          <w:sz w:val="32"/>
+        </w:rPr>
+        <w:t>5. Outcome Tiers &amp; Actionable Recommendations</w:t>
+      </w:r>
+    </w:p>
+    <w:p>
+      <w:pPr>
+        <w:keepNext/>
+        <w:spacing w:before="280" w:after="120"/>
+      </w:pPr>
+      <w:r>
+        <w:rPr>
+          <w:rFonts w:ascii="Arial" w:hAnsi="Arial"/>
+          <w:b/>
+          <w:color w:val="0F172A"/>
+          <w:sz w:val="26"/>
+        </w:rPr>
+        <w:t>TIER 1: Owner-Dependent Job Warning (Score 0 – 50 • ~2.0x EBITDA)</w:t>
+      </w:r>
+    </w:p>
+    <w:p>
+      <w:r>
+        <w:rPr>
+          <w:b/>
+        </w:rPr>
+        <w:t xml:space="preserve">Headline: </w:t>
+      </w:r>
+      <w:r>
+        <w:t>High Founder Dependency — Action Plan to Build Your SOP Infrastructure</w:t>
+      </w:r>
+    </w:p>
+    <w:p>
+      <w:r>
+        <w:rPr>
+          <w:b/>
+        </w:rPr>
+        <w:t xml:space="preserve">Description: </w:t>
+      </w:r>
+      <w:r>
+        <w:t>Acquirers look for businesses that run smoothly without the founder. At your current score, a buyer would view purchasing your business as buying a demanding job rather than a self-sustaining asset.</w:t>
+      </w:r>
+    </w:p>
+    <w:p>
+      <w:pPr>
+        <w:keepNext/>
+        <w:spacing w:before="200" w:after="80"/>
+      </w:pPr>
+      <w:r>
+        <w:rPr>
+          <w:rFonts w:ascii="Arial" w:hAnsi="Arial"/>
+          <w:b/>
+          <w:color w:val="0F172A"/>
+          <w:sz w:val="23"/>
+        </w:rPr>
+        <w:t>Actionable Recommendations Roadmap:</w:t>
+      </w:r>
+    </w:p>
+    <w:p>
+      <w:pPr>
+        <w:pStyle w:val="ListBullet"/>
+      </w:pPr>
+      <w:r>
+        <w:rPr>
+          <w:b/>
+        </w:rPr>
+        <w:t xml:space="preserve">Step 1: </w:t>
+      </w:r>
+      <w:r>
+        <w:t>Document all of your core daily operations into standardized step-by-step operating procedures (SOPs).</w:t>
+      </w:r>
+    </w:p>
+    <w:p>
+      <w:pPr>
+        <w:pStyle w:val="ListBullet"/>
+      </w:pPr>
+      <w:r>
+        <w:rPr>
+          <w:b/>
+        </w:rPr>
+        <w:t xml:space="preserve">Step 2: </w:t>
+      </w:r>
+      <w:r>
+        <w:t>Promote or hire an operational manager to handle your day-to-day client fulfillment and team oversight.</w:t>
+      </w:r>
+    </w:p>
+    <w:p>
+      <w:pPr>
+        <w:pStyle w:val="ListBullet"/>
+      </w:pPr>
+      <w:r>
+        <w:rPr>
+          <w:b/>
+        </w:rPr>
+        <w:t xml:space="preserve">Step 3: </w:t>
+      </w:r>
+      <w:r>
+        <w:t>Systematize your lead generation and sales calls so revenue isn't dependent on your personal effort.</w:t>
+      </w:r>
+    </w:p>
+    <w:p>
+      <w:pPr>
+        <w:pStyle w:val="ListBullet"/>
+      </w:pPr>
+      <w:r>
+        <w:rPr>
+          <w:b/>
+        </w:rPr>
+        <w:t xml:space="preserve">Step 4: </w:t>
+      </w:r>
+      <w:r>
+        <w:t>Transition your key client relationships to your team members over a 6-month period.</w:t>
+      </w:r>
+    </w:p>
+    <w:p/>
+    <w:p>
+      <w:pPr>
+        <w:keepNext/>
+        <w:spacing w:before="280" w:after="120"/>
+      </w:pPr>
+      <w:r>
+        <w:rPr>
+          <w:rFonts w:ascii="Arial" w:hAnsi="Arial"/>
+          <w:b/>
+          <w:color w:val="0F172A"/>
+          <w:sz w:val="26"/>
+        </w:rPr>
+        <w:t>TIER 2: High-Risk Asset with Potential (Score 51 – 70 • ~3.8x EBITDA)</w:t>
+      </w:r>
+    </w:p>
+    <w:p>
+      <w:r>
+        <w:rPr>
+          <w:b/>
+        </w:rPr>
+        <w:t xml:space="preserve">Headline: </w:t>
+      </w:r>
+      <w:r>
+        <w:t>Sellable with Valuation Discounts — Your Risk Mitigation Roadmap</w:t>
+      </w:r>
+    </w:p>
+    <w:p>
+      <w:r>
+        <w:rPr>
+          <w:b/>
+        </w:rPr>
+        <w:t xml:space="preserve">Description: </w:t>
+      </w:r>
+      <w:r>
+        <w:t>Your business is sellable, but buyers will likely apply valuation discounts to protect against key risk factors (such as customer concentration, lack of long-term contracts, or reliance on you).</w:t>
+      </w:r>
+    </w:p>
+    <w:p>
+      <w:pPr>
+        <w:keepNext/>
+        <w:spacing w:before="200" w:after="80"/>
+      </w:pPr>
+      <w:r>
+        <w:rPr>
+          <w:rFonts w:ascii="Arial" w:hAnsi="Arial"/>
+          <w:b/>
+          <w:color w:val="0F172A"/>
+          <w:sz w:val="23"/>
+        </w:rPr>
+        <w:t>Actionable Recommendations Roadmap:</w:t>
+      </w:r>
+    </w:p>
+    <w:p>
+      <w:pPr>
+        <w:pStyle w:val="ListBullet"/>
+      </w:pPr>
+      <w:r>
+        <w:rPr>
+          <w:b/>
+        </w:rPr>
+        <w:t xml:space="preserve">Step 1: </w:t>
+      </w:r>
+      <w:r>
+        <w:t>Diversify your customer base so no single client represents over 15% of your annual revenue.</w:t>
+      </w:r>
+    </w:p>
+    <w:p>
+      <w:pPr>
+        <w:pStyle w:val="ListBullet"/>
+      </w:pPr>
+      <w:r>
+        <w:rPr>
+          <w:b/>
+        </w:rPr>
+        <w:t xml:space="preserve">Step 2: </w:t>
+      </w:r>
+      <w:r>
+        <w:t>Lock your top accounts into 1 to 3 year binding contracts with clear renewal terms.</w:t>
+      </w:r>
+    </w:p>
+    <w:p>
+      <w:pPr>
+        <w:pStyle w:val="ListBullet"/>
+      </w:pPr>
+      <w:r>
+        <w:rPr>
+          <w:b/>
+        </w:rPr>
+        <w:t xml:space="preserve">Step 3: </w:t>
+      </w:r>
+      <w:r>
+        <w:t>Formalize employee non-competes and retention incentives for your key team members.</w:t>
+      </w:r>
+    </w:p>
+    <w:p>
+      <w:pPr>
+        <w:pStyle w:val="ListBullet"/>
+      </w:pPr>
+      <w:r>
+        <w:rPr>
+          <w:b/>
+        </w:rPr>
+        <w:t xml:space="preserve">Step 4: </w:t>
+      </w:r>
+      <w:r>
+        <w:t>Clean up your internal accounting records to prepare for buyer due diligence.</w:t>
+      </w:r>
+    </w:p>
+    <w:p/>
+    <w:p>
+      <w:pPr>
+        <w:keepNext/>
+        <w:spacing w:before="280" w:after="120"/>
+      </w:pPr>
+      <w:r>
+        <w:rPr>
+          <w:rFonts w:ascii="Arial" w:hAnsi="Arial"/>
+          <w:b/>
+          <w:color w:val="0F172A"/>
+          <w:sz w:val="26"/>
+        </w:rPr>
+        <w:t>TIER 3: Strong Valuation &amp; Highly Marketable (Score 71 – 89 • ~5.8x EBITDA)</w:t>
+      </w:r>
+    </w:p>
+    <w:p>
+      <w:r>
+        <w:rPr>
+          <w:b/>
+        </w:rPr>
+        <w:t xml:space="preserve">Headline: </w:t>
+      </w:r>
+      <w:r>
+        <w:t>Highly Marketable Business — You Are Ready for Competitive Offers</w:t>
+      </w:r>
+    </w:p>
+    <w:p>
+      <w:r>
+        <w:rPr>
+          <w:b/>
+        </w:rPr>
+        <w:t xml:space="preserve">Description: </w:t>
+      </w:r>
+      <w:r>
+        <w:t>You have built a clean, scalable business with strong profit margins, solid management, and diversified revenue. Buyers will actively compete for a business with your profile.</w:t>
+      </w:r>
+    </w:p>
+    <w:p>
+      <w:pPr>
+        <w:keepNext/>
+        <w:spacing w:before="200" w:after="80"/>
+      </w:pPr>
+      <w:r>
+        <w:rPr>
+          <w:rFonts w:ascii="Arial" w:hAnsi="Arial"/>
+          <w:b/>
+          <w:color w:val="0F172A"/>
+          <w:sz w:val="23"/>
+        </w:rPr>
+        <w:t>Actionable Recommendations Roadmap:</w:t>
+      </w:r>
+    </w:p>
+    <w:p>
+      <w:pPr>
+        <w:pStyle w:val="ListBullet"/>
+      </w:pPr>
+      <w:r>
+        <w:rPr>
+          <w:b/>
+        </w:rPr>
+        <w:t xml:space="preserve">Step 1: </w:t>
+      </w:r>
+      <w:r>
+        <w:t>Engage a Quality of Earnings (QofE) auditor to pre-verify your EBITDA calculations.</w:t>
+      </w:r>
+    </w:p>
+    <w:p>
+      <w:pPr>
+        <w:pStyle w:val="ListBullet"/>
+      </w:pPr>
+      <w:r>
+        <w:rPr>
+          <w:b/>
+        </w:rPr>
+        <w:t xml:space="preserve">Step 2: </w:t>
+      </w:r>
+      <w:r>
+        <w:t>Optimize your recurring revenue models to convert transactional sales into subscription or long-term contracts.</w:t>
+      </w:r>
+    </w:p>
+    <w:p>
+      <w:pPr>
+        <w:pStyle w:val="ListBullet"/>
+      </w:pPr>
+      <w:r>
+        <w:rPr>
+          <w:b/>
+        </w:rPr>
+        <w:t xml:space="preserve">Step 3: </w:t>
+      </w:r>
+      <w:r>
+        <w:t>Build a clear 3-year growth narrative showing your untapped expansion channels for an acquirer.</w:t>
+      </w:r>
+    </w:p>
+    <w:p>
+      <w:pPr>
+        <w:pStyle w:val="ListBullet"/>
+      </w:pPr>
+      <w:r>
+        <w:rPr>
+          <w:b/>
+        </w:rPr>
+        <w:t xml:space="preserve">Step 4: </w:t>
+      </w:r>
+      <w:r>
+        <w:t>Interview top M&amp;A brokers or investment bankers to structure a competitive bidding process for your exit.</w:t>
+      </w:r>
+    </w:p>
+    <w:p/>
+    <w:p>
+      <w:pPr>
+        <w:keepNext/>
+        <w:spacing w:before="280" w:after="120"/>
+      </w:pPr>
+      <w:r>
+        <w:rPr>
+          <w:rFonts w:ascii="Arial" w:hAnsi="Arial"/>
+          <w:b/>
+          <w:color w:val="0F172A"/>
+          <w:sz w:val="26"/>
+        </w:rPr>
+        <w:t>TIER 4: Premium Exit Asset (Score 90 – 100 • ~8.5x EBITDA)</w:t>
+      </w:r>
+    </w:p>
+    <w:p>
+      <w:r>
+        <w:rPr>
+          <w:b/>
+        </w:rPr>
+        <w:t xml:space="preserve">Headline: </w:t>
+      </w:r>
+      <w:r>
+        <w:t>Trophy Business Asset — You Have Achieved Elite Exit Valuation Potential</w:t>
+      </w:r>
+    </w:p>
+    <w:p>
+      <w:r>
+        <w:rPr>
+          <w:b/>
+        </w:rPr>
+        <w:t xml:space="preserve">Description: </w:t>
+      </w:r>
+      <w:r>
+        <w:t>Fewer than 3% of business owners achieve this tier. Your business features autonomous management, high-margin recurring cash flows, bulletproof contracts, and clean audited financials.</w:t>
+      </w:r>
+    </w:p>
+    <w:p>
+      <w:pPr>
+        <w:keepNext/>
+        <w:spacing w:before="200" w:after="80"/>
+      </w:pPr>
+      <w:r>
+        <w:rPr>
+          <w:rFonts w:ascii="Arial" w:hAnsi="Arial"/>
+          <w:b/>
+          <w:color w:val="0F172A"/>
+          <w:sz w:val="23"/>
+        </w:rPr>
+        <w:t>Actionable Recommendations Roadmap:</w:t>
+      </w:r>
+    </w:p>
+    <w:p>
+      <w:pPr>
+        <w:pStyle w:val="ListBullet"/>
+      </w:pPr>
+      <w:r>
+        <w:rPr>
+          <w:b/>
+        </w:rPr>
+        <w:t xml:space="preserve">Step 1: </w:t>
+      </w:r>
+      <w:r>
+        <w:t>Run a targeted private auction through a tier-1 M&amp;A advisory firm to maximize your enterprise valuation.</w:t>
+      </w:r>
+    </w:p>
+    <w:p>
+      <w:pPr>
+        <w:pStyle w:val="ListBullet"/>
+      </w:pPr>
+      <w:r>
+        <w:rPr>
+          <w:b/>
+        </w:rPr>
+        <w:t xml:space="preserve">Step 2: </w:t>
+      </w:r>
+      <w:r>
+        <w:t>Evaluate strategic buyers who can extract massive synergy value beyond standard market multiples.</w:t>
+      </w:r>
+    </w:p>
+    <w:p>
+      <w:pPr>
+        <w:pStyle w:val="ListBullet"/>
+      </w:pPr>
+      <w:r>
+        <w:rPr>
+          <w:b/>
+        </w:rPr>
+        <w:t xml:space="preserve">Step 3: </w:t>
+      </w:r>
+      <w:r>
+        <w:t>Structure tax-optimized exit strategies (e.g. rollover equity, installment structures, asset vs stock sale).</w:t>
+      </w:r>
+    </w:p>
+    <w:p>
+      <w:pPr>
+        <w:pStyle w:val="ListBullet"/>
+      </w:pPr>
+      <w:r>
+        <w:rPr>
+          <w:b/>
+        </w:rPr>
+        <w:t xml:space="preserve">Step 4: </w:t>
+      </w:r>
+      <w:r>
+        <w:t>Prepare key management retention packages to ensure zero disruption during your ownership transfer.</w:t>
+      </w:r>
+    </w:p>
+    <w:p/>
+    <w:p>
+      <w:pPr>
+        <w:keepNext/>
+        <w:spacing w:before="360" w:after="160"/>
+      </w:pPr>
+      <w:r>
+        <w:rPr>
+          <w:rFonts w:ascii="Arial" w:hAnsi="Arial"/>
+          <w:b/>
+          <w:color w:val="2ABAD2"/>
+          <w:sz w:val="32"/>
+        </w:rPr>
+        <w:t>6. Unfiltered Advisory Call &amp; Accelerator CTAs</w:t>
       </w:r>
     </w:p>
     <w:tbl>
@@ -1836,7 +2594,7 @@
                 <w:color w:val="0F172A"/>
                 <w:sz w:val="22"/>
               </w:rPr>
-              <w:t>Calculation Formula Summary:</w:t>
+              <w:t>Closing High-Converting Call to Action:</w:t>
               <w:br/>
             </w:r>
             <w:r>
@@ -1844,520 +2602,21 @@
                 <w:color w:val="0F172A"/>
                 <w:sz w:val="21"/>
               </w:rPr>
-              <w:t>1. Raw Points Tally = Sum of points from answered active questions.</w:t>
+              <w:t>Headline: 'This Is What’s Standing Between Where You Are Now and a Premium Exit.'</w:t>
               <w:br/>
-              <w:t>2. Normalized Baseline Score = Math.round((RawTotal / MaxPossibleActive) * 100)</w:t>
               <w:br/>
-              <w:t>3. Recurring Multiplier Rule: If Q10 option 'Over 50%' selected ➔ BaseScore = Math.round(BaseScore * 1.15)</w:t>
+              <w:t>Body: 'If you want the unfiltered version — book thirty minutes with me. No sales pitch, no generic advice, just your numbers, your primary value killer, and a battle-tested roadmap to capture your £ valuation gap.'</w:t>
               <w:br/>
-              <w:t>4. Declining Growth Cap Rule: If Q3 option 'Declining' selected ➔ FinalScore = Math.min(FinalScore, 70)</w:t>
               <w:br/>
-              <w:t>5. Final Score is clamped between 0 and 100.</w:t>
+              <w:t>Primary Action Button: Book 30-Min Unfiltered Valuation Review With Gary →</w:t>
+              <w:br/>
+              <w:t>Secondary Link: Join Gary's Business Accelerator (£/mo): https://garyashworth.com/business-accelerator</w:t>
             </w:r>
           </w:p>
         </w:tc>
       </w:tr>
     </w:tbl>
     <w:p/>
-    <w:p>
-      <w:pPr>
-        <w:keepNext/>
-        <w:spacing w:before="360" w:after="160"/>
-      </w:pPr>
-      <w:r>
-        <w:rPr>
-          <w:rFonts w:ascii="Arial" w:hAnsi="Arial"/>
-          <w:b/>
-          <w:color w:val="2ABAD2"/>
-          <w:sz w:val="32"/>
-        </w:rPr>
-        <w:t>4. Outcome Tiers &amp; Recommendations</w:t>
-      </w:r>
-    </w:p>
-    <w:p>
-      <w:pPr>
-        <w:keepNext/>
-        <w:spacing w:before="280" w:after="120"/>
-      </w:pPr>
-      <w:r>
-        <w:rPr>
-          <w:rFonts w:ascii="Arial" w:hAnsi="Arial"/>
-          <w:b/>
-          <w:color w:val="0F172A"/>
-          <w:sz w:val="26"/>
-        </w:rPr>
-        <w:t>TIER 1: Owner-Dependent Job Warning (Score 0 – 50)</w:t>
-      </w:r>
-    </w:p>
-    <w:p>
-      <w:r>
-        <w:rPr>
-          <w:b/>
-        </w:rPr>
-        <w:t xml:space="preserve">Headline: </w:t>
-      </w:r>
-      <w:r>
-        <w:t>High Founder Dependency — Action Plan to Build Your SOP Infrastructure</w:t>
-      </w:r>
-    </w:p>
-    <w:p>
-      <w:r>
-        <w:rPr>
-          <w:b/>
-        </w:rPr>
-        <w:t xml:space="preserve">Description: </w:t>
-      </w:r>
-      <w:r>
-        <w:t>Acquirers look for businesses that run smoothly without the founder. At your current score, a buyer would view purchasing your business as buying a demanding job rather than a self-sustaining asset.</w:t>
-      </w:r>
-    </w:p>
-    <w:p>
-      <w:pPr>
-        <w:keepNext/>
-        <w:spacing w:before="200" w:after="80"/>
-      </w:pPr>
-      <w:r>
-        <w:rPr>
-          <w:rFonts w:ascii="Arial" w:hAnsi="Arial"/>
-          <w:b/>
-          <w:color w:val="0F172A"/>
-          <w:sz w:val="23"/>
-        </w:rPr>
-        <w:t>Actionable Recommendations Roadmap:</w:t>
-      </w:r>
-    </w:p>
-    <w:p>
-      <w:pPr>
-        <w:pStyle w:val="ListBullet"/>
-      </w:pPr>
-      <w:r>
-        <w:rPr>
-          <w:b/>
-        </w:rPr>
-        <w:t xml:space="preserve">Step 1: </w:t>
-      </w:r>
-      <w:r>
-        <w:t>Document all of your core daily operations into standardized step-by-step operating procedures (SOPs).</w:t>
-      </w:r>
-    </w:p>
-    <w:p>
-      <w:pPr>
-        <w:pStyle w:val="ListBullet"/>
-      </w:pPr>
-      <w:r>
-        <w:rPr>
-          <w:b/>
-        </w:rPr>
-        <w:t xml:space="preserve">Step 2: </w:t>
-      </w:r>
-      <w:r>
-        <w:t>Promote or hire an operational manager to handle your day-to-day client fulfillment and team oversight.</w:t>
-      </w:r>
-    </w:p>
-    <w:p>
-      <w:pPr>
-        <w:pStyle w:val="ListBullet"/>
-      </w:pPr>
-      <w:r>
-        <w:rPr>
-          <w:b/>
-        </w:rPr>
-        <w:t xml:space="preserve">Step 3: </w:t>
-      </w:r>
-      <w:r>
-        <w:t>Systematize your lead generation and sales calls so revenue isn't dependent on your personal effort.</w:t>
-      </w:r>
-    </w:p>
-    <w:p>
-      <w:pPr>
-        <w:pStyle w:val="ListBullet"/>
-      </w:pPr>
-      <w:r>
-        <w:rPr>
-          <w:b/>
-        </w:rPr>
-        <w:t xml:space="preserve">Step 4: </w:t>
-      </w:r>
-      <w:r>
-        <w:t>Transition your key client relationships to your team members over a 6-month period.</w:t>
-      </w:r>
-    </w:p>
-    <w:p/>
-    <w:p>
-      <w:pPr>
-        <w:keepNext/>
-        <w:spacing w:before="280" w:after="120"/>
-      </w:pPr>
-      <w:r>
-        <w:rPr>
-          <w:rFonts w:ascii="Arial" w:hAnsi="Arial"/>
-          <w:b/>
-          <w:color w:val="0F172A"/>
-          <w:sz w:val="26"/>
-        </w:rPr>
-        <w:t>TIER 2: High-Risk Asset with Potential (Score 51 – 70)</w:t>
-      </w:r>
-    </w:p>
-    <w:p>
-      <w:r>
-        <w:rPr>
-          <w:b/>
-        </w:rPr>
-        <w:t xml:space="preserve">Headline: </w:t>
-      </w:r>
-      <w:r>
-        <w:t>Sellable with Valuation Discounts — Your Risk Mitigation Roadmap</w:t>
-      </w:r>
-    </w:p>
-    <w:p>
-      <w:r>
-        <w:rPr>
-          <w:b/>
-        </w:rPr>
-        <w:t xml:space="preserve">Description: </w:t>
-      </w:r>
-      <w:r>
-        <w:t>Your business is sellable, but buyers will likely apply valuation discounts to protect against key risk factors (such as customer concentration, lack of long-term contracts, or reliance on you).</w:t>
-      </w:r>
-    </w:p>
-    <w:p>
-      <w:pPr>
-        <w:keepNext/>
-        <w:spacing w:before="200" w:after="80"/>
-      </w:pPr>
-      <w:r>
-        <w:rPr>
-          <w:rFonts w:ascii="Arial" w:hAnsi="Arial"/>
-          <w:b/>
-          <w:color w:val="0F172A"/>
-          <w:sz w:val="23"/>
-        </w:rPr>
-        <w:t>Actionable Recommendations Roadmap:</w:t>
-      </w:r>
-    </w:p>
-    <w:p>
-      <w:pPr>
-        <w:pStyle w:val="ListBullet"/>
-      </w:pPr>
-      <w:r>
-        <w:rPr>
-          <w:b/>
-        </w:rPr>
-        <w:t xml:space="preserve">Step 1: </w:t>
-      </w:r>
-      <w:r>
-        <w:t>Diversify your customer base so no single client represents over 15% of your annual revenue.</w:t>
-      </w:r>
-    </w:p>
-    <w:p>
-      <w:pPr>
-        <w:pStyle w:val="ListBullet"/>
-      </w:pPr>
-      <w:r>
-        <w:rPr>
-          <w:b/>
-        </w:rPr>
-        <w:t xml:space="preserve">Step 2: </w:t>
-      </w:r>
-      <w:r>
-        <w:t>Lock your top accounts into 1 to 3 year binding contracts with clear renewal terms.</w:t>
-      </w:r>
-    </w:p>
-    <w:p>
-      <w:pPr>
-        <w:pStyle w:val="ListBullet"/>
-      </w:pPr>
-      <w:r>
-        <w:rPr>
-          <w:b/>
-        </w:rPr>
-        <w:t xml:space="preserve">Step 3: </w:t>
-      </w:r>
-      <w:r>
-        <w:t>Formalize employee non-competes and retention incentives for your key team members.</w:t>
-      </w:r>
-    </w:p>
-    <w:p>
-      <w:pPr>
-        <w:pStyle w:val="ListBullet"/>
-      </w:pPr>
-      <w:r>
-        <w:rPr>
-          <w:b/>
-        </w:rPr>
-        <w:t xml:space="preserve">Step 4: </w:t>
-      </w:r>
-      <w:r>
-        <w:t>Clean up your internal accounting records to prepare for buyer due diligence.</w:t>
-      </w:r>
-    </w:p>
-    <w:p/>
-    <w:p>
-      <w:pPr>
-        <w:keepNext/>
-        <w:spacing w:before="280" w:after="120"/>
-      </w:pPr>
-      <w:r>
-        <w:rPr>
-          <w:rFonts w:ascii="Arial" w:hAnsi="Arial"/>
-          <w:b/>
-          <w:color w:val="0F172A"/>
-          <w:sz w:val="26"/>
-        </w:rPr>
-        <w:t>TIER 3: Strong Valuation &amp; Highly Marketable (Score 71 – 89)</w:t>
-      </w:r>
-    </w:p>
-    <w:p>
-      <w:r>
-        <w:rPr>
-          <w:b/>
-        </w:rPr>
-        <w:t xml:space="preserve">Headline: </w:t>
-      </w:r>
-      <w:r>
-        <w:t>Highly Marketable Business — You Are Ready for Competitive Offers</w:t>
-      </w:r>
-    </w:p>
-    <w:p>
-      <w:r>
-        <w:rPr>
-          <w:b/>
-        </w:rPr>
-        <w:t xml:space="preserve">Description: </w:t>
-      </w:r>
-      <w:r>
-        <w:t>You have built a clean, scalable business with strong profit margins, solid management, and diversified revenue. Buyers will actively compete for a business with your profile.</w:t>
-      </w:r>
-    </w:p>
-    <w:p>
-      <w:pPr>
-        <w:keepNext/>
-        <w:spacing w:before="200" w:after="80"/>
-      </w:pPr>
-      <w:r>
-        <w:rPr>
-          <w:rFonts w:ascii="Arial" w:hAnsi="Arial"/>
-          <w:b/>
-          <w:color w:val="0F172A"/>
-          <w:sz w:val="23"/>
-        </w:rPr>
-        <w:t>Actionable Recommendations Roadmap:</w:t>
-      </w:r>
-    </w:p>
-    <w:p>
-      <w:pPr>
-        <w:pStyle w:val="ListBullet"/>
-      </w:pPr>
-      <w:r>
-        <w:rPr>
-          <w:b/>
-        </w:rPr>
-        <w:t xml:space="preserve">Step 1: </w:t>
-      </w:r>
-      <w:r>
-        <w:t>Engage a Quality of Earnings (QofE) auditor to pre-verify your EBITDA calculations.</w:t>
-      </w:r>
-    </w:p>
-    <w:p>
-      <w:pPr>
-        <w:pStyle w:val="ListBullet"/>
-      </w:pPr>
-      <w:r>
-        <w:rPr>
-          <w:b/>
-        </w:rPr>
-        <w:t xml:space="preserve">Step 2: </w:t>
-      </w:r>
-      <w:r>
-        <w:t>Optimize your recurring revenue models to convert transactional sales into subscription or long-term contracts.</w:t>
-      </w:r>
-    </w:p>
-    <w:p>
-      <w:pPr>
-        <w:pStyle w:val="ListBullet"/>
-      </w:pPr>
-      <w:r>
-        <w:rPr>
-          <w:b/>
-        </w:rPr>
-        <w:t xml:space="preserve">Step 3: </w:t>
-      </w:r>
-      <w:r>
-        <w:t>Build a clear 3-year growth narrative showing your untapped expansion channels for an acquirer.</w:t>
-      </w:r>
-    </w:p>
-    <w:p>
-      <w:pPr>
-        <w:pStyle w:val="ListBullet"/>
-      </w:pPr>
-      <w:r>
-        <w:rPr>
-          <w:b/>
-        </w:rPr>
-        <w:t xml:space="preserve">Step 4: </w:t>
-      </w:r>
-      <w:r>
-        <w:t>Interview top M&amp;A brokers or investment bankers to structure a competitive bidding process for your exit.</w:t>
-      </w:r>
-    </w:p>
-    <w:p/>
-    <w:p>
-      <w:pPr>
-        <w:keepNext/>
-        <w:spacing w:before="280" w:after="120"/>
-      </w:pPr>
-      <w:r>
-        <w:rPr>
-          <w:rFonts w:ascii="Arial" w:hAnsi="Arial"/>
-          <w:b/>
-          <w:color w:val="0F172A"/>
-          <w:sz w:val="26"/>
-        </w:rPr>
-        <w:t>TIER 4: Premium Exit Asset (Score 90 – 100)</w:t>
-      </w:r>
-    </w:p>
-    <w:p>
-      <w:r>
-        <w:rPr>
-          <w:b/>
-        </w:rPr>
-        <w:t xml:space="preserve">Headline: </w:t>
-      </w:r>
-      <w:r>
-        <w:t>Trophy Business Asset — You Have Achieved Elite Exit Valuation Potential</w:t>
-      </w:r>
-    </w:p>
-    <w:p>
-      <w:r>
-        <w:rPr>
-          <w:b/>
-        </w:rPr>
-        <w:t xml:space="preserve">Description: </w:t>
-      </w:r>
-      <w:r>
-        <w:t>Fewer than 3% of business owners achieve this tier. Your business features autonomous management, high-margin recurring cash flows, bulletproof contracts, and clean audited financials.</w:t>
-      </w:r>
-    </w:p>
-    <w:p>
-      <w:pPr>
-        <w:keepNext/>
-        <w:spacing w:before="200" w:after="80"/>
-      </w:pPr>
-      <w:r>
-        <w:rPr>
-          <w:rFonts w:ascii="Arial" w:hAnsi="Arial"/>
-          <w:b/>
-          <w:color w:val="0F172A"/>
-          <w:sz w:val="23"/>
-        </w:rPr>
-        <w:t>Actionable Recommendations Roadmap:</w:t>
-      </w:r>
-    </w:p>
-    <w:p>
-      <w:pPr>
-        <w:pStyle w:val="ListBullet"/>
-      </w:pPr>
-      <w:r>
-        <w:rPr>
-          <w:b/>
-        </w:rPr>
-        <w:t xml:space="preserve">Step 1: </w:t>
-      </w:r>
-      <w:r>
-        <w:t>Run a targeted private auction through a tier-1 M&amp;A advisory firm to maximize your enterprise valuation.</w:t>
-      </w:r>
-    </w:p>
-    <w:p>
-      <w:pPr>
-        <w:pStyle w:val="ListBullet"/>
-      </w:pPr>
-      <w:r>
-        <w:rPr>
-          <w:b/>
-        </w:rPr>
-        <w:t xml:space="preserve">Step 2: </w:t>
-      </w:r>
-      <w:r>
-        <w:t>Evaluate strategic buyers who can extract massive synergy value beyond standard market multiples.</w:t>
-      </w:r>
-    </w:p>
-    <w:p>
-      <w:pPr>
-        <w:pStyle w:val="ListBullet"/>
-      </w:pPr>
-      <w:r>
-        <w:rPr>
-          <w:b/>
-        </w:rPr>
-        <w:t xml:space="preserve">Step 3: </w:t>
-      </w:r>
-      <w:r>
-        <w:t>Structure tax-optimized exit strategies (e.g. rollover equity, installment structures, asset vs stock sale).</w:t>
-      </w:r>
-    </w:p>
-    <w:p>
-      <w:pPr>
-        <w:pStyle w:val="ListBullet"/>
-      </w:pPr>
-      <w:r>
-        <w:rPr>
-          <w:b/>
-        </w:rPr>
-        <w:t xml:space="preserve">Step 4: </w:t>
-      </w:r>
-      <w:r>
-        <w:t>Prepare key management retention packages to ensure zero disruption during your ownership transfer.</w:t>
-      </w:r>
-    </w:p>
-    <w:p/>
-    <w:p>
-      <w:pPr>
-        <w:keepNext/>
-        <w:spacing w:before="360" w:after="160"/>
-      </w:pPr>
-      <w:r>
-        <w:rPr>
-          <w:rFonts w:ascii="Arial" w:hAnsi="Arial"/>
-          <w:b/>
-          <w:color w:val="2ABAD2"/>
-          <w:sz w:val="32"/>
-        </w:rPr>
-        <w:t>5. Advisory &amp; Lead Nurturing Call to Actions</w:t>
-      </w:r>
-    </w:p>
-    <w:p>
-      <w:r>
-        <w:rPr>
-          <w:b/>
-        </w:rPr>
-        <w:t xml:space="preserve">Recommendations Section Heading: </w:t>
-      </w:r>
-      <w:r>
-        <w:t>My General Recommendations Based on Your Answers</w:t>
-      </w:r>
-    </w:p>
-    <w:p>
-      <w:r>
-        <w:rPr>
-          <w:b/>
-        </w:rPr>
-        <w:t xml:space="preserve">Advisory Call &amp; Accelerator Subtext: </w:t>
-      </w:r>
-      <w:r>
-        <w:t>If you want a more personalized assessment, schedule a 30-minute 1:1 advisory call with me or join my Business Accelerator: https://garyashworth.com/business-accelerator</w:t>
-      </w:r>
-    </w:p>
-    <w:p>
-      <w:r>
-        <w:rPr>
-          <w:b/>
-        </w:rPr>
-        <w:t xml:space="preserve">Report Actions: </w:t>
-      </w:r>
-      <w:r>
-        <w:t>Print / Save PDF Report button &amp; Retake Assessment button.</w:t>
-      </w:r>
-    </w:p>
     <w:sectPr>
       <w:pgSz w:w="12240" w:h="15840"/>
       <w:pgMar w:top="1440" w:right="1440" w:bottom="1440" w:left="1440" w:header="720" w:footer="720" w:gutter="0"/>

</xml_diff>

<commit_message>
Implement Master Build Specification Version 2: corrected scoring engine, multiple sizing caps, ordered value killers, and Q16 CTA routing
</commit_message>
<xml_diff>
--- a/Business_Sellability_Assessment_Master_Architecture.docx
+++ b/Business_Sellability_Assessment_Master_Architecture.docx
@@ -13,8 +13,6 @@
           <w:color w:val="0F172A"/>
           <w:sz w:val="44"/>
         </w:rPr>
-        <w:t>GARY ASHWORTH</w:t>
-        <w:br/>
         <w:t>BUSINESS SELLABILITY DIAGNOSTIC</w:t>
       </w:r>
     </w:p>
@@ -27,9 +25,11 @@
           <w:rFonts w:ascii="Arial" w:hAnsi="Arial"/>
           <w:i/>
           <w:color w:val="2ABAD2"/>
-          <w:sz w:val="26"/>
+          <w:sz w:val="24"/>
         </w:rPr>
-        <w:t>Valuation Multiplier Engine, #1 Value Killer Diagnosis &amp; Master Specification</w:t>
+        <w:t>Gary Ashworth · Master build specification, version 2.</w:t>
+        <w:br/>
+        <w:t>Scoring engine, valuation model, diagnosis logic and final copy.</w:t>
       </w:r>
     </w:p>
     <w:p/>
@@ -43,9 +43,96 @@
           <w:rFonts w:ascii="Arial" w:hAnsi="Arial"/>
           <w:b/>
           <w:color w:val="2ABAD2"/>
-          <w:sz w:val="32"/>
+          <w:sz w:val="30"/>
         </w:rPr>
-        <w:t>1. Landing Page &amp; Lead Capture Copy</w:t>
+        <w:t>0. How the Engine Works</w:t>
+      </w:r>
+    </w:p>
+    <w:p>
+      <w:r>
+        <w:t>Read this before building anything else. The scoring in version 1 did not add up to 100, which meant roughly half of all respondents would have been told they owned a trophy business. Everything below assumes the corrected model.</w:t>
+      </w:r>
+    </w:p>
+    <w:tbl>
+      <w:tblPr>
+        <w:tblW w:type="auto" w:w="0"/>
+        <w:jc w:val="center"/>
+        <w:tblLook w:firstColumn="1" w:firstRow="1" w:lastColumn="0" w:lastRow="0" w:noHBand="0" w:noVBand="1" w:val="04A0"/>
+      </w:tblPr>
+      <w:tblGrid>
+        <w:gridCol w:w="9360"/>
+      </w:tblGrid>
+      <w:tr>
+        <w:tc>
+          <w:tcPr>
+            <w:tcW w:type="dxa" w:w="9360"/>
+            <w:shd w:fill="F0FDFA"/>
+            <w:tcBorders>
+              <w:top w:val="none"/>
+              <w:left w:val="single" w:sz="24" w:space="0" w:color="2ABAD2"/>
+              <w:bottom w:val="none"/>
+              <w:right w:val="none"/>
+            </w:tcBorders>
+          </w:tcPr>
+          <w:p>
+            <w:pPr>
+              <w:spacing w:before="80" w:after="80"/>
+            </w:pPr>
+            <w:r>
+              <w:rPr>
+                <w:b/>
+                <w:color w:val="0F172A"/>
+                <w:sz w:val="21"/>
+              </w:rPr>
+              <w:t>Scoring Rules &amp; Hard Constraints:</w:t>
+              <w:br/>
+            </w:r>
+            <w:r>
+              <w:rPr>
+                <w:color w:val="0F172A"/>
+                <w:sz w:val="20"/>
+              </w:rPr>
+              <w:t>• Fifteen scored questions plus three conditionals. Raw points total 174 at maximum.</w:t>
+              <w:br/>
+              <w:t>• Final score = (raw points / 174) x 100, rounded to one decimal, then clamped between 0 and 100.</w:t>
+              <w:br/>
+              <w:t>• The recurring revenue bonus is applied to the valuation multiple (+0.5x), not to the score.</w:t>
+              <w:br/>
+              <w:t>• Question 16 carries no points. It routes the call to action only.</w:t>
+              <w:br/>
+              <w:t>• Estimated revenue and margin figures are backend values and never appear on screen.</w:t>
+              <w:br/>
+              <w:br/>
+              <w:t>HARD RULES:</w:t>
+              <w:br/>
+              <w:t>• Q3 = Declining (Going backwards): Final score capped at 55 (top of Tier 2 at best).</w:t>
+              <w:br/>
+              <w:t>• Q5 = Sales drop to zero (They stop): Sets Owner Dependent flag. Suppresses ready to sell language.</w:t>
+              <w:br/>
+              <w:t>• Q2 = Negative/breakeven AND Q2B = Structural issues: Suppress pound valuation. Show Broken Economics result.</w:t>
+              <w:br/>
+              <w:t>• Q10 = Over 50%: Adds 0.5x to valuation multiple, after size cap.</w:t>
+              <w:br/>
+              <w:t>• Q1 = Under 1 million: Multiple capped at 4.0x regardless of score.</w:t>
+            </w:r>
+          </w:p>
+        </w:tc>
+      </w:tr>
+    </w:tbl>
+    <w:p/>
+    <w:p>
+      <w:pPr>
+        <w:keepNext/>
+        <w:spacing w:before="360" w:after="160"/>
+      </w:pPr>
+      <w:r>
+        <w:rPr>
+          <w:rFonts w:ascii="Arial" w:hAnsi="Arial"/>
+          <w:b/>
+          <w:color w:val="2ABAD2"/>
+          <w:sz w:val="30"/>
+        </w:rPr>
+        <w:t>1. Landing Page and Lead Capture</w:t>
       </w:r>
     </w:p>
     <w:tbl>
@@ -77,17 +164,17 @@
               <w:rPr>
                 <w:b/>
                 <w:color w:val="0F172A"/>
-                <w:sz w:val="22"/>
+                <w:sz w:val="21"/>
               </w:rPr>
-              <w:t>⚠️ Hard Exit Statistic Banner:</w:t>
+              <w:t>⚠️ Banner Statistic:</w:t>
               <w:br/>
             </w:r>
             <w:r>
               <w:rPr>
                 <w:color w:val="0F172A"/>
-                <w:sz w:val="21"/>
+                <w:sz w:val="20"/>
               </w:rPr>
-              <w:t>Fact: 70% to 80% of businesses prepared for sale NEVER actually sell. (Exit Planning Institute)</w:t>
+              <w:t>Between 70% and 80% of businesses that go to market never sell. Source: Exit Planning Institute.</w:t>
             </w:r>
           </w:p>
         </w:tc>
@@ -99,10 +186,10 @@
         <w:rPr>
           <w:b/>
         </w:rPr>
-        <w:t xml:space="preserve">Main Headline: </w:t>
-      </w:r>
-      <w:r>
-        <w:t>Would Anyone Really Want to Buy Your Business? And If They Do, What Is It Actually Worth?</w:t>
+        <w:t xml:space="preserve">Headline: </w:t>
+      </w:r>
+      <w:r>
+        <w:t>If you put your business on the market next Monday, what would a buyer really pay for it?</w:t>
       </w:r>
     </w:p>
     <w:p>
@@ -110,10 +197,10 @@
         <w:rPr>
           <w:b/>
         </w:rPr>
-        <w:t xml:space="preserve">Main Subtitle: </w:t>
-      </w:r>
-      <w:r>
-        <w:t>Take my 3-minute executive diagnostic to calculate your estimated £ valuation, discover your multiple tier, and pinpoint your #1 value killer before buyers do.</w:t>
+        <w:t xml:space="preserve">Subheadline: </w:t>
+      </w:r>
+      <w:r>
+        <w:t>Answer sixteen questions and I will show you the number, the multiple your business earns today, and the one thing doing the most damage to your price.</w:t>
       </w:r>
     </w:p>
     <w:p>
@@ -124,7 +211,7 @@
         <w:t xml:space="preserve">Duration Badge: </w:t>
       </w:r>
       <w:r>
-        <w:t>⏱️ Takes just 2–3 minutes to complete</w:t>
+        <w:t>About four minutes. No jargon.</w:t>
       </w:r>
     </w:p>
     <w:p>
@@ -132,10 +219,21 @@
         <w:rPr>
           <w:b/>
         </w:rPr>
-        <w:t xml:space="preserve">Credibility Banner: </w:t>
-      </w:r>
-      <w:r>
-        <w:t>Based on my 40+ years of experience buying, scaling, and selling 30+ businesses, combined with proven M&amp;A deal standards.</w:t>
+        <w:t xml:space="preserve">Credibility Block: </w:t>
+      </w:r>
+      <w:r>
+        <w:t>Forty years of buying, building and selling businesses. Thirty of them, give or take, and a fair few lessons I paid for the hard way.</w:t>
+      </w:r>
+    </w:p>
+    <w:p>
+      <w:r>
+        <w:rPr>
+          <w:b/>
+        </w:rPr>
+        <w:t xml:space="preserve">Secondary Credibility Block (Results Page / Under the fold): </w:t>
+      </w:r>
+      <w:r>
+        <w:t>"I assumed my tech recruitment business would sell for eight to ten times EBITDA, because that is what the sector had always achieved. By the time I came to sell, the going rate was five. Nobody had told me the market had moved, and that gap cost me millions. This diagnostic exists so it does not happen to you."</w:t>
       </w:r>
     </w:p>
     <w:p>
@@ -148,9 +246,9 @@
           <w:rFonts w:ascii="Arial" w:hAnsi="Arial"/>
           <w:b/>
           <w:color w:val="0F172A"/>
-          <w:sz w:val="26"/>
+          <w:sz w:val="25"/>
         </w:rPr>
-        <w:t>Transformational Outcome Cards</w:t>
+        <w:t>What You Get at the End</w:t>
       </w:r>
     </w:p>
     <w:p>
@@ -161,10 +259,10 @@
         <w:rPr>
           <w:b/>
         </w:rPr>
-        <w:t xml:space="preserve">Your £ Valuation &amp; Multiple: </w:t>
-      </w:r>
-      <w:r>
-        <w:t>Discover what buyers would realistically pay today versus what a tier-90 business commands.</w:t>
+        <w:t xml:space="preserve">Your number: </w:t>
+      </w:r>
+      <w:r>
+        <w:t>What a buyer would likely pay today, and the multiple your business is earning.</w:t>
       </w:r>
     </w:p>
     <w:p>
@@ -175,10 +273,10 @@
         <w:rPr>
           <w:b/>
         </w:rPr>
-        <w:t xml:space="preserve">Your #1 Value Killer Diagnosed: </w:t>
-      </w:r>
-      <w:r>
-        <w:t>Pinpoint the exact single operational, founder, or concentration risk destroying your exit price.</w:t>
+        <w:t xml:space="preserve">Your biggest value killer: </w:t>
+      </w:r>
+      <w:r>
+        <w:t>The single risk taking the most money off your price, named and costed.</w:t>
       </w:r>
     </w:p>
     <w:p>
@@ -189,10 +287,10 @@
         <w:rPr>
           <w:b/>
         </w:rPr>
-        <w:t xml:space="preserve">The Valuation Gap Blueprint: </w:t>
-      </w:r>
-      <w:r>
-        <w:t>Calculate the exact £ money left on the table and unlock a roadmap to capture it.</w:t>
+        <w:t xml:space="preserve">Your gap: </w:t>
+      </w:r>
+      <w:r>
+        <w:t>The difference in pounds between what you would get today and the ceiling for a business your size, with the order I would fix things in.</w:t>
       </w:r>
     </w:p>
     <w:p>
@@ -205,9 +303,33 @@
           <w:rFonts w:ascii="Arial" w:hAnsi="Arial"/>
           <w:b/>
           <w:color w:val="0F172A"/>
-          <w:sz w:val="26"/>
+          <w:sz w:val="25"/>
         </w:rPr>
-        <w:t>Lead Capture Form Inputs</w:t>
+        <w:t>Form Fields</w:t>
+      </w:r>
+    </w:p>
+    <w:p>
+      <w:pPr>
+        <w:pStyle w:val="ListBullet"/>
+      </w:pPr>
+      <w:r>
+        <w:t>Full name, required</w:t>
+      </w:r>
+    </w:p>
+    <w:p>
+      <w:pPr>
+        <w:pStyle w:val="ListBullet"/>
+      </w:pPr>
+      <w:r>
+        <w:t>Work email, required</w:t>
+      </w:r>
+    </w:p>
+    <w:p>
+      <w:pPr>
+        <w:pStyle w:val="ListBullet"/>
+      </w:pPr>
+      <w:r>
+        <w:t>Company name, optional</w:t>
       </w:r>
     </w:p>
     <w:p>
@@ -218,38 +340,10 @@
         <w:rPr>
           <w:b/>
         </w:rPr>
-        <w:t xml:space="preserve">Full Name </w:t>
-      </w:r>
-      <w:r>
-        <w:t>(Text field, required)</w:t>
-      </w:r>
-    </w:p>
-    <w:p>
-      <w:pPr>
-        <w:pStyle w:val="ListBullet"/>
-      </w:pPr>
-      <w:r>
-        <w:rPr>
-          <w:b/>
-        </w:rPr>
-        <w:t xml:space="preserve">Work Email Address </w:t>
-      </w:r>
-      <w:r>
-        <w:t>(Email field, required)</w:t>
-      </w:r>
-    </w:p>
-    <w:p>
-      <w:pPr>
-        <w:pStyle w:val="ListBullet"/>
-      </w:pPr>
-      <w:r>
-        <w:rPr>
-          <w:b/>
-        </w:rPr>
-        <w:t xml:space="preserve">Primary CTA Button: </w:t>
-      </w:r>
-      <w:r>
-        <w:t>Begin Your Business Sellability Diagnostic →</w:t>
+        <w:t xml:space="preserve">Button copy: </w:t>
+      </w:r>
+      <w:r>
+        <w:t>Start the diagnostic</w:t>
       </w:r>
     </w:p>
     <w:p>
@@ -262,9 +356,9 @@
           <w:rFonts w:ascii="Arial" w:hAnsi="Arial"/>
           <w:b/>
           <w:color w:val="2ABAD2"/>
-          <w:sz w:val="32"/>
+          <w:sz w:val="30"/>
         </w:rPr>
-        <w:t>2. Complete Question Architecture &amp; Logic Rules</w:t>
+        <w:t>2. Questions and Logic (Copy is Final)</w:t>
       </w:r>
     </w:p>
     <w:p>
@@ -277,9 +371,9 @@
           <w:rFonts w:ascii="Arial" w:hAnsi="Arial"/>
           <w:b/>
           <w:color w:val="0F172A"/>
-          <w:sz w:val="26"/>
+          <w:sz w:val="25"/>
         </w:rPr>
-        <w:t>SECTION 1: Financial Foundations</w:t>
+        <w:t>Section 1: The money</w:t>
       </w:r>
     </w:p>
     <w:p>
@@ -292,9 +386,9 @@
           <w:rFonts w:ascii="Arial" w:hAnsi="Arial"/>
           <w:b/>
           <w:color w:val="0F172A"/>
-          <w:sz w:val="23"/>
+          <w:sz w:val="22"/>
         </w:rPr>
-        <w:t>Question 1: What is your top line revenue over the trailing twelve months (TTM)?</w:t>
+        <w:t>Q1. What was your turnover over the last twelve months?</w:t>
       </w:r>
     </w:p>
     <w:p>
@@ -303,7 +397,7 @@
           <w:i/>
           <w:color w:val="64748B"/>
         </w:rPr>
-        <w:t>Subtitle / Context: Revenue scale establishes your baseline valuation tier and determines which buyer pools will compete for your asset.</w:t>
+        <w:t>Context: Revenue decides which buyers will look at you at all, and it sets the ceiling on what any of them will pay.</w:t>
       </w:r>
     </w:p>
     <w:p>
@@ -314,10 +408,10 @@
         <w:rPr>
           <w:b/>
         </w:rPr>
-        <w:t xml:space="preserve">Under £1 Million </w:t>
-      </w:r>
-      <w:r>
-        <w:t>(5 pts - Est. £650k)</w:t>
+        <w:t xml:space="preserve">Under 1 million </w:t>
+      </w:r>
+      <w:r>
+        <w:t>(5 pts, backend estimate 650k)</w:t>
       </w:r>
     </w:p>
     <w:p>
@@ -328,10 +422,10 @@
         <w:rPr>
           <w:b/>
         </w:rPr>
-        <w:t xml:space="preserve">£1 Million to £3 Million </w:t>
-      </w:r>
-      <w:r>
-        <w:t>(10 pts - Est. £2.0M)</w:t>
+        <w:t xml:space="preserve">1 million to 3 million </w:t>
+      </w:r>
+      <w:r>
+        <w:t>(10 pts, backend estimate 2.0m)</w:t>
       </w:r>
     </w:p>
     <w:p>
@@ -342,10 +436,10 @@
         <w:rPr>
           <w:b/>
         </w:rPr>
-        <w:t xml:space="preserve">£3 Million to £10 Million </w:t>
-      </w:r>
-      <w:r>
-        <w:t>(15 pts - Est. £6.0M)</w:t>
+        <w:t xml:space="preserve">3 million to 10 million </w:t>
+      </w:r>
+      <w:r>
+        <w:t>(15 pts, backend estimate 6.0m)</w:t>
       </w:r>
     </w:p>
     <w:p>
@@ -356,10 +450,10 @@
         <w:rPr>
           <w:b/>
         </w:rPr>
-        <w:t xml:space="preserve">Over £10 Million </w:t>
-      </w:r>
-      <w:r>
-        <w:t>(20 pts - Est. £15.0M)</w:t>
+        <w:t xml:space="preserve">Over 10 million </w:t>
+      </w:r>
+      <w:r>
+        <w:t>(20 pts, backend estimate 15.0m)</w:t>
       </w:r>
     </w:p>
     <w:p>
@@ -372,9 +466,9 @@
           <w:rFonts w:ascii="Arial" w:hAnsi="Arial"/>
           <w:b/>
           <w:color w:val="0F172A"/>
-          <w:sz w:val="23"/>
+          <w:sz w:val="22"/>
         </w:rPr>
-        <w:t>Question 2: What is your average net profit margin?</w:t>
+        <w:t>Q2. What is your net profit margin before your own salary, interest and tax?</w:t>
       </w:r>
     </w:p>
     <w:p>
@@ -383,7 +477,7 @@
           <w:i/>
           <w:color w:val="64748B"/>
         </w:rPr>
-        <w:t>Subtitle / Context: Healthy net margins demonstrate operational efficiency and generate the transferable EBITDA buyers actually pay for.</w:t>
+        <w:t>Context: This is the number buyers price off. Turnover is what you tell people at dinner, margin is what somebody buys.</w:t>
       </w:r>
     </w:p>
     <w:p>
@@ -394,10 +488,10 @@
         <w:rPr>
           <w:b/>
         </w:rPr>
-        <w:t xml:space="preserve">Negative or Breakeven </w:t>
-      </w:r>
-      <w:r>
-        <w:t>(0 pts - Triggers Conditional Q2B (Est. 3%))</w:t>
+        <w:t xml:space="preserve">Negative or breakeven </w:t>
+      </w:r>
+      <w:r>
+        <w:t>(0 pts, triggers Q2B, backend estimate 3%)</w:t>
       </w:r>
     </w:p>
     <w:p>
@@ -411,7 +505,7 @@
         <w:t xml:space="preserve">1% to 10% </w:t>
       </w:r>
       <w:r>
-        <w:t>(5 pts - Est. 7.5%)</w:t>
+        <w:t>(5 pts, backend estimate 7.5%)</w:t>
       </w:r>
     </w:p>
     <w:p>
@@ -425,7 +519,7 @@
         <w:t xml:space="preserve">11% to 20% </w:t>
       </w:r>
       <w:r>
-        <w:t>(10 pts - Est. 15%)</w:t>
+        <w:t>(10 pts, backend estimate 15%)</w:t>
       </w:r>
     </w:p>
     <w:p>
@@ -439,7 +533,7 @@
         <w:t xml:space="preserve">Over 20% </w:t>
       </w:r>
       <w:r>
-        <w:t>(15 pts - Est. 25%)</w:t>
+        <w:t>(15 pts, backend estimate 25%)</w:t>
       </w:r>
     </w:p>
     <w:p>
@@ -452,9 +546,9 @@
           <w:rFonts w:ascii="Arial" w:hAnsi="Arial"/>
           <w:b/>
           <w:color w:val="0F172A"/>
-          <w:sz w:val="23"/>
+          <w:sz w:val="22"/>
         </w:rPr>
-        <w:t>Question 2B (Conditional): What is the primary reason for your negative or breakeven profit margin?</w:t>
+        <w:t>Q2B (conditional). Why is the business not making money?</w:t>
       </w:r>
     </w:p>
     <w:p>
@@ -463,7 +557,7 @@
           <w:i/>
           <w:color w:val="64748B"/>
         </w:rPr>
-        <w:t>Subtitle / Context: Differentiating deliberate growth investment from systemic weakness determines whether buyers see upside or operational risk.</w:t>
+        <w:t>Context: Losing money on purpose whilst you grow is a very different conversation to losing money because something is broken.</w:t>
       </w:r>
     </w:p>
     <w:p>
@@ -474,10 +568,10 @@
         <w:rPr>
           <w:b/>
         </w:rPr>
-        <w:t xml:space="preserve">Deliberate reinvestment for aggressive growth </w:t>
-      </w:r>
-      <w:r>
-        <w:t>(+3 pts restored)</w:t>
+        <w:t xml:space="preserve">Deliberate reinvestment to grow faster </w:t>
+      </w:r>
+      <w:r>
+        <w:t>(+3 pts)</w:t>
       </w:r>
     </w:p>
     <w:p>
@@ -491,7 +585,7 @@
         <w:t xml:space="preserve">Temporary market conditions </w:t>
       </w:r>
       <w:r>
-        <w:t>(+1 pt restored)</w:t>
+        <w:t>(+1 pt)</w:t>
       </w:r>
     </w:p>
     <w:p>
@@ -502,7 +596,7 @@
         <w:rPr>
           <w:b/>
         </w:rPr>
-        <w:t xml:space="preserve">Poor pricing structure </w:t>
+        <w:t xml:space="preserve">Pricing is wrong </w:t>
       </w:r>
       <w:r>
         <w:t>(0 pts)</w:t>
@@ -516,10 +610,10 @@
         <w:rPr>
           <w:b/>
         </w:rPr>
-        <w:t xml:space="preserve">Structural business issues </w:t>
-      </w:r>
-      <w:r>
-        <w:t>(-5 pts penalty)</w:t>
+        <w:t xml:space="preserve">Structural problems in the business </w:t>
+      </w:r>
+      <w:r>
+        <w:t>(-5 pts, suppresses pound valuation)</w:t>
       </w:r>
     </w:p>
     <w:p>
@@ -532,9 +626,9 @@
           <w:rFonts w:ascii="Arial" w:hAnsi="Arial"/>
           <w:b/>
           <w:color w:val="0F172A"/>
-          <w:sz w:val="23"/>
+          <w:sz w:val="22"/>
         </w:rPr>
-        <w:t>Question 3: What is your revenue growth rate year over year (YoY)?</w:t>
+        <w:t>Q3. How is turnover moving year on year?</w:t>
       </w:r>
     </w:p>
     <w:p>
@@ -543,7 +637,7 @@
           <w:i/>
           <w:color w:val="64748B"/>
         </w:rPr>
-        <w:t>Subtitle / Context: Growth trajectory is the ultimate multiplier. Acquirers severely discount or walk away from contracting businesses.</w:t>
+        <w:t>Context: Buyers are paying for the next three years of profit, and a falling line tells them the next three will be worse than the last three.</w:t>
       </w:r>
     </w:p>
     <w:p>
@@ -554,10 +648,10 @@
         <w:rPr>
           <w:b/>
         </w:rPr>
-        <w:t xml:space="preserve">Declining </w:t>
-      </w:r>
-      <w:r>
-        <w:t>(0 pts)</w:t>
+        <w:t xml:space="preserve">Going backwards </w:t>
+      </w:r>
+      <w:r>
+        <w:t>(0 pts, caps final score at 55)</w:t>
       </w:r>
     </w:p>
     <w:p>
@@ -568,7 +662,7 @@
         <w:rPr>
           <w:b/>
         </w:rPr>
-        <w:t xml:space="preserve">Flat (0% growth) </w:t>
+        <w:t xml:space="preserve">Flat </w:t>
       </w:r>
       <w:r>
         <w:t>(5 pts)</w:t>
@@ -596,58 +690,12 @@
         <w:rPr>
           <w:b/>
         </w:rPr>
-        <w:t xml:space="preserve">Growing over 15% </w:t>
+        <w:t xml:space="preserve">Growing more than 15% </w:t>
       </w:r>
       <w:r>
         <w:t>(15 pts)</w:t>
       </w:r>
     </w:p>
-    <w:tbl>
-      <w:tblPr>
-        <w:tblW w:type="auto" w:w="0"/>
-        <w:jc w:val="center"/>
-        <w:tblLook w:firstColumn="1" w:firstRow="1" w:lastColumn="0" w:lastRow="0" w:noHBand="0" w:noVBand="1" w:val="04A0"/>
-      </w:tblPr>
-      <w:tblGrid>
-        <w:gridCol w:w="9360"/>
-      </w:tblGrid>
-      <w:tr>
-        <w:tc>
-          <w:tcPr>
-            <w:tcW w:type="dxa" w:w="9360"/>
-            <w:shd w:fill="F0F9FF"/>
-            <w:tcBorders>
-              <w:top w:val="none"/>
-              <w:left w:val="single" w:sz="24" w:space="0" w:color="2ABAD2"/>
-              <w:bottom w:val="none"/>
-              <w:right w:val="none"/>
-            </w:tcBorders>
-          </w:tcPr>
-          <w:p>
-            <w:pPr>
-              <w:spacing w:before="80" w:after="80"/>
-            </w:pPr>
-            <w:r>
-              <w:rPr>
-                <w:b/>
-                <w:color w:val="0F172A"/>
-                <w:sz w:val="22"/>
-              </w:rPr>
-              <w:t>Backend Logic Rule:</w:t>
-              <w:br/>
-            </w:r>
-            <w:r>
-              <w:rPr>
-                <w:color w:val="0F172A"/>
-                <w:sz w:val="21"/>
-              </w:rPr>
-              <w:t>Selecting Declining sets a hard rule capping your maximum possible final score at 70/100. Buyers severely discount shrinking assets.</w:t>
-            </w:r>
-          </w:p>
-        </w:tc>
-      </w:tr>
-    </w:tbl>
-    <w:p/>
     <w:p>
       <w:pPr>
         <w:keepNext/>
@@ -658,9 +706,9 @@
           <w:rFonts w:ascii="Arial" w:hAnsi="Arial"/>
           <w:b/>
           <w:color w:val="0F172A"/>
-          <w:sz w:val="26"/>
+          <w:sz w:val="25"/>
         </w:rPr>
-        <w:t>SECTION 2: Owner Dependence</w:t>
+        <w:t>Section 2: How much of it is you</w:t>
       </w:r>
     </w:p>
     <w:p>
@@ -673,9 +721,9 @@
           <w:rFonts w:ascii="Arial" w:hAnsi="Arial"/>
           <w:b/>
           <w:color w:val="0F172A"/>
-          <w:sz w:val="23"/>
+          <w:sz w:val="22"/>
         </w:rPr>
-        <w:t>Question 4: How many hours a week do you spend on front-line daily operations?</w:t>
+        <w:t>Q4. How many hours a week do you spend on the day to day work?</w:t>
       </w:r>
     </w:p>
     <w:p>
@@ -684,7 +732,7 @@
           <w:i/>
           <w:color w:val="64748B"/>
         </w:rPr>
-        <w:t>Subtitle / Context: The more daily operations depend directly on you, the harder it is for a buyer to step in without you.</w:t>
+        <w:t>Context: The more of the daily running that goes through you, the harder it is for anyone else to take over.</w:t>
       </w:r>
     </w:p>
     <w:p>
@@ -695,7 +743,7 @@
         <w:rPr>
           <w:b/>
         </w:rPr>
-        <w:t xml:space="preserve">Over 40 hours per week </w:t>
+        <w:t xml:space="preserve">More than 40 </w:t>
       </w:r>
       <w:r>
         <w:t>(0 pts)</w:t>
@@ -709,7 +757,7 @@
         <w:rPr>
           <w:b/>
         </w:rPr>
-        <w:t xml:space="preserve">20 to 40 hours per week </w:t>
+        <w:t xml:space="preserve">20 to 40 </w:t>
       </w:r>
       <w:r>
         <w:t>(3 pts)</w:t>
@@ -723,7 +771,7 @@
         <w:rPr>
           <w:b/>
         </w:rPr>
-        <w:t xml:space="preserve">5 to 20 hours per week </w:t>
+        <w:t xml:space="preserve">5 to 20 </w:t>
       </w:r>
       <w:r>
         <w:t>(7 pts)</w:t>
@@ -737,7 +785,7 @@
         <w:rPr>
           <w:b/>
         </w:rPr>
-        <w:t xml:space="preserve">Under 5 hours per week </w:t>
+        <w:t xml:space="preserve">Under 5 </w:t>
       </w:r>
       <w:r>
         <w:t>(10 pts)</w:t>
@@ -753,9 +801,9 @@
           <w:rFonts w:ascii="Arial" w:hAnsi="Arial"/>
           <w:b/>
           <w:color w:val="0F172A"/>
-          <w:sz w:val="23"/>
+          <w:sz w:val="22"/>
         </w:rPr>
-        <w:t>Question 5: What happens to your sales if you step away completely for 3 months?</w:t>
+        <w:t>Q5. What happens to sales if you disappear for three months?</w:t>
       </w:r>
     </w:p>
     <w:p>
@@ -764,7 +812,7 @@
           <w:i/>
           <w:color w:val="64748B"/>
         </w:rPr>
-        <w:t>Subtitle / Context: Tests whether your revenue engine is an institutional machine or a personal rolodex.</w:t>
+        <w:t>Context: This is the question that separates a business from a well paid job.</w:t>
       </w:r>
     </w:p>
     <w:p>
@@ -775,10 +823,10 @@
         <w:rPr>
           <w:b/>
         </w:rPr>
-        <w:t xml:space="preserve">Sales drop to zero </w:t>
-      </w:r>
-      <w:r>
-        <w:t>(0 pts)</w:t>
+        <w:t xml:space="preserve">They stop </w:t>
+      </w:r>
+      <w:r>
+        <w:t>(0 pts, sets Owner Dependent flag)</w:t>
       </w:r>
     </w:p>
     <w:p>
@@ -789,7 +837,7 @@
         <w:rPr>
           <w:b/>
         </w:rPr>
-        <w:t xml:space="preserve">Sales decrease by half </w:t>
+        <w:t xml:space="preserve">They halve </w:t>
       </w:r>
       <w:r>
         <w:t>(3 pts)</w:t>
@@ -803,7 +851,7 @@
         <w:rPr>
           <w:b/>
         </w:rPr>
-        <w:t xml:space="preserve">Sales stay flat </w:t>
+        <w:t xml:space="preserve">They hold steady </w:t>
       </w:r>
       <w:r>
         <w:t>(7 pts)</w:t>
@@ -817,58 +865,12 @@
         <w:rPr>
           <w:b/>
         </w:rPr>
-        <w:t xml:space="preserve">Sales actually increase </w:t>
+        <w:t xml:space="preserve">They keep growing, because the team runs it </w:t>
       </w:r>
       <w:r>
         <w:t>(10 pts)</w:t>
       </w:r>
     </w:p>
-    <w:tbl>
-      <w:tblPr>
-        <w:tblW w:type="auto" w:w="0"/>
-        <w:jc w:val="center"/>
-        <w:tblLook w:firstColumn="1" w:firstRow="1" w:lastColumn="0" w:lastRow="0" w:noHBand="0" w:noVBand="1" w:val="04A0"/>
-      </w:tblPr>
-      <w:tblGrid>
-        <w:gridCol w:w="9360"/>
-      </w:tblGrid>
-      <w:tr>
-        <w:tc>
-          <w:tcPr>
-            <w:tcW w:type="dxa" w:w="9360"/>
-            <w:shd w:fill="F0F9FF"/>
-            <w:tcBorders>
-              <w:top w:val="none"/>
-              <w:left w:val="single" w:sz="24" w:space="0" w:color="2ABAD2"/>
-              <w:bottom w:val="none"/>
-              <w:right w:val="none"/>
-            </w:tcBorders>
-          </w:tcPr>
-          <w:p>
-            <w:pPr>
-              <w:spacing w:before="80" w:after="80"/>
-            </w:pPr>
-            <w:r>
-              <w:rPr>
-                <w:b/>
-                <w:color w:val="0F172A"/>
-                <w:sz w:val="22"/>
-              </w:rPr>
-              <w:t>Backend Logic Rule:</w:t>
-              <w:br/>
-            </w:r>
-            <w:r>
-              <w:rPr>
-                <w:color w:val="0F172A"/>
-                <w:sz w:val="21"/>
-              </w:rPr>
-              <w:t>Selecting Sales drop to zero triggers the Institutional Buyer Flag. Marked as non-transferable without an autonomous sales engine.</w:t>
-            </w:r>
-          </w:p>
-        </w:tc>
-      </w:tr>
-    </w:tbl>
-    <w:p/>
     <w:p>
       <w:pPr>
         <w:keepNext/>
@@ -879,9 +881,9 @@
           <w:rFonts w:ascii="Arial" w:hAnsi="Arial"/>
           <w:b/>
           <w:color w:val="0F172A"/>
-          <w:sz w:val="23"/>
+          <w:sz w:val="22"/>
         </w:rPr>
-        <w:t>Question 6: Do you have a second-in-command who can run daily operations autonomously?</w:t>
+        <w:t>Q6. Do you have a number two who can run the place without you?</w:t>
       </w:r>
     </w:p>
     <w:p>
@@ -890,7 +892,7 @@
           <w:i/>
           <w:color w:val="64748B"/>
         </w:rPr>
-        <w:t>Subtitle / Context: A proven management team transforms your business from a founder-dependent job into a high-multiple asset.</w:t>
+        <w:t>Context: A proper second in command moves your final price more than almost anything else on this list.</w:t>
       </w:r>
     </w:p>
     <w:p>
@@ -901,7 +903,7 @@
         <w:rPr>
           <w:b/>
         </w:rPr>
-        <w:t xml:space="preserve">No second-in-command </w:t>
+        <w:t xml:space="preserve">No </w:t>
       </w:r>
       <w:r>
         <w:t>(0 pts)</w:t>
@@ -915,7 +917,7 @@
         <w:rPr>
           <w:b/>
         </w:rPr>
-        <w:t xml:space="preserve">Yes, but they are very new </w:t>
+        <w:t xml:space="preserve">Yes, but they are new </w:t>
       </w:r>
       <w:r>
         <w:t>(3 pts)</w:t>
@@ -943,10 +945,10 @@
         <w:rPr>
           <w:b/>
         </w:rPr>
-        <w:t xml:space="preserve">Yes, with a long proven track record </w:t>
-      </w:r>
-      <w:r>
-        <w:t>(12 pts (+12 Bonus Points))</w:t>
+        <w:t xml:space="preserve">Yes, and they have a long track record </w:t>
+      </w:r>
+      <w:r>
+        <w:t>(12 pts)</w:t>
       </w:r>
     </w:p>
     <w:p>
@@ -959,9 +961,9 @@
           <w:rFonts w:ascii="Arial" w:hAnsi="Arial"/>
           <w:b/>
           <w:color w:val="0F172A"/>
-          <w:sz w:val="26"/>
+          <w:sz w:val="25"/>
         </w:rPr>
-        <w:t>SECTION 3: Concentration Risks</w:t>
+        <w:t>Section 3: Where it could all go wrong</w:t>
       </w:r>
     </w:p>
     <w:p>
@@ -974,9 +976,9 @@
           <w:rFonts w:ascii="Arial" w:hAnsi="Arial"/>
           <w:b/>
           <w:color w:val="0F172A"/>
-          <w:sz w:val="23"/>
+          <w:sz w:val="22"/>
         </w:rPr>
-        <w:t>Question 7: What percentage of your total revenue comes from your single largest customer?</w:t>
+        <w:t>Q7. What share of turnover comes from your largest customer?</w:t>
       </w:r>
     </w:p>
     <w:p>
@@ -985,7 +987,7 @@
           <w:i/>
           <w:color w:val="64748B"/>
         </w:rPr>
-        <w:t>Subtitle / Context: High customer concentration is the #1 deal-killer during acquirer financing and due diligence.</w:t>
+        <w:t>Context: One big customer is the thing that most often kills a deal at the last minute, usually the week the buyer's bank gets involved.</w:t>
       </w:r>
     </w:p>
     <w:p>
@@ -1041,7 +1043,7 @@
         <w:t xml:space="preserve">Over 30% </w:t>
       </w:r>
       <w:r>
-        <w:t>(-5 pts penalty - Triggers Conditional Q7B)</w:t>
+        <w:t>(-5 pts, triggers Q7B)</w:t>
       </w:r>
     </w:p>
     <w:p>
@@ -1054,9 +1056,9 @@
           <w:rFonts w:ascii="Arial" w:hAnsi="Arial"/>
           <w:b/>
           <w:color w:val="0F172A"/>
-          <w:sz w:val="23"/>
+          <w:sz w:val="22"/>
         </w:rPr>
-        <w:t>Question 7B (Conditional): Is that major customer locked into a binding contract or agreement?</w:t>
+        <w:t>Q7B (conditional). Is that customer on a contract?</w:t>
       </w:r>
     </w:p>
     <w:p>
@@ -1065,7 +1067,7 @@
           <w:i/>
           <w:color w:val="64748B"/>
         </w:rPr>
-        <w:t>Subtitle / Context: Contractual terms determine how securely your concentrated cash flow is protected.</w:t>
+        <w:t>Context: A signed long term agreement changes how a buyer views the same concentration.</w:t>
       </w:r>
     </w:p>
     <w:p>
@@ -1076,10 +1078,10 @@
         <w:rPr>
           <w:b/>
         </w:rPr>
-        <w:t xml:space="preserve">Locked into a long-term binding contract </w:t>
-      </w:r>
-      <w:r>
-        <w:t>(+3 pts penalty softened)</w:t>
+        <w:t xml:space="preserve">Long term binding contract </w:t>
+      </w:r>
+      <w:r>
+        <w:t>(+3 pts)</w:t>
       </w:r>
     </w:p>
     <w:p>
@@ -1090,7 +1092,7 @@
         <w:rPr>
           <w:b/>
         </w:rPr>
-        <w:t xml:space="preserve">Operates on a month-to-month basis </w:t>
+        <w:t xml:space="preserve">Rolling month to month </w:t>
       </w:r>
       <w:r>
         <w:t>(0 pts)</w:t>
@@ -1104,7 +1106,7 @@
         <w:rPr>
           <w:b/>
         </w:rPr>
-        <w:t xml:space="preserve">Pays upfront in advance </w:t>
+        <w:t xml:space="preserve">Pays upfront </w:t>
       </w:r>
       <w:r>
         <w:t>(+1 pt)</w:t>
@@ -1118,10 +1120,10 @@
         <w:rPr>
           <w:b/>
         </w:rPr>
-        <w:t xml:space="preserve">Consistently pays late </w:t>
-      </w:r>
-      <w:r>
-        <w:t>(-3 pts penalty)</w:t>
+        <w:t xml:space="preserve">Pays late, every time </w:t>
+      </w:r>
+      <w:r>
+        <w:t>(-3 pts)</w:t>
       </w:r>
     </w:p>
     <w:p>
@@ -1134,9 +1136,9 @@
           <w:rFonts w:ascii="Arial" w:hAnsi="Arial"/>
           <w:b/>
           <w:color w:val="0F172A"/>
-          <w:sz w:val="23"/>
+          <w:sz w:val="22"/>
         </w:rPr>
-        <w:t>Question 8: How easy would it be for you to replace your primary supplier or vendor?</w:t>
+        <w:t>Q8. How easily could you replace your main supplier?</w:t>
       </w:r>
     </w:p>
     <w:p>
@@ -1145,7 +1147,7 @@
           <w:i/>
           <w:color w:val="64748B"/>
         </w:rPr>
-        <w:t>Subtitle / Context: Single-point-of-failure suppliers create operational fragility that buyers discount.</w:t>
+        <w:t>Context: A supplier you cannot replace is somebody else's hand on your margin.</w:t>
       </w:r>
     </w:p>
     <w:p>
@@ -1156,10 +1158,10 @@
         <w:rPr>
           <w:b/>
         </w:rPr>
-        <w:t xml:space="preserve">Impossible due to exclusive patents or single source </w:t>
-      </w:r>
-      <w:r>
-        <w:t>(0 pts)</w:t>
+        <w:t xml:space="preserve">One supplier, no realistic alternative </w:t>
+      </w:r>
+      <w:r>
+        <w:t>(0 pts, triggers Q8B)</w:t>
       </w:r>
     </w:p>
     <w:p>
@@ -1170,7 +1172,7 @@
         <w:rPr>
           <w:b/>
         </w:rPr>
-        <w:t xml:space="preserve">Extremely difficult </w:t>
+        <w:t xml:space="preserve">Very difficult, it would cost us time and margin </w:t>
       </w:r>
       <w:r>
         <w:t>(2 pts)</w:t>
@@ -1184,7 +1186,7 @@
         <w:rPr>
           <w:b/>
         </w:rPr>
-        <w:t xml:space="preserve">Moderately difficult but possible </w:t>
+        <w:t xml:space="preserve">Doable with some disruption </w:t>
       </w:r>
       <w:r>
         <w:t>(6 pts)</w:t>
@@ -1198,7 +1200,7 @@
         <w:rPr>
           <w:b/>
         </w:rPr>
-        <w:t xml:space="preserve">Very easy with multiple vendors available </w:t>
+        <w:t xml:space="preserve">Easy, several suppliers compete for our business </w:t>
       </w:r>
       <w:r>
         <w:t>(10 pts)</w:t>
@@ -1214,9 +1216,9 @@
           <w:rFonts w:ascii="Arial" w:hAnsi="Arial"/>
           <w:b/>
           <w:color w:val="0F172A"/>
-          <w:sz w:val="23"/>
+          <w:sz w:val="22"/>
         </w:rPr>
-        <w:t>Question 9: What would happen to your business if your top salesperson left tomorrow?</w:t>
+        <w:t>Q8B (conditional). Is that single source something you own or control, such as an exclusive licence, a patent or an agreement nobody else can get?</w:t>
       </w:r>
     </w:p>
     <w:p>
@@ -1225,7 +1227,7 @@
           <w:i/>
           <w:color w:val="64748B"/>
         </w:rPr>
-        <w:t>Subtitle / Context: Measures whether your sales system belongs to the business or resides in an individual's head.</w:t>
+        <w:t>Context: Owning the only route to market is an asset. Being hostage to somebody else's is a risk.</w:t>
       </w:r>
     </w:p>
     <w:p>
@@ -1236,10 +1238,10 @@
         <w:rPr>
           <w:b/>
         </w:rPr>
-        <w:t xml:space="preserve">Catastrophic loss of revenue </w:t>
-      </w:r>
-      <w:r>
-        <w:t>(0 pts)</w:t>
+        <w:t xml:space="preserve">Yes, we own or control it </w:t>
+      </w:r>
+      <w:r>
+        <w:t>(+8 pts)</w:t>
       </w:r>
     </w:p>
     <w:p>
@@ -1250,68 +1252,120 @@
         <w:rPr>
           <w:b/>
         </w:rPr>
-        <w:t xml:space="preserve">Significant revenue drop for months </w:t>
-      </w:r>
-      <w:r>
-        <w:t>(3 pts)</w:t>
+        <w:t xml:space="preserve">No, we are dependent on them </w:t>
+      </w:r>
+      <w:r>
+        <w:t>(0 pts)</w:t>
       </w:r>
     </w:p>
     <w:p>
       <w:pPr>
-        <w:pStyle w:val="ListBullet"/>
-      </w:pPr>
-      <w:r>
-        <w:rPr>
-          <w:b/>
-        </w:rPr>
-        <w:t xml:space="preserve">Temporary dip in sales </w:t>
-      </w:r>
-      <w:r>
-        <w:t>(7 pts)</w:t>
-      </w:r>
-    </w:p>
-    <w:p>
-      <w:pPr>
-        <w:pStyle w:val="ListBullet"/>
-      </w:pPr>
-      <w:r>
-        <w:rPr>
-          <w:b/>
-        </w:rPr>
-        <w:t xml:space="preserve">Negligible impact because sales rely on automated marketing systems </w:t>
-      </w:r>
-      <w:r>
-        <w:t>(10 pts)</w:t>
-      </w:r>
-    </w:p>
-    <w:p>
-      <w:pPr>
         <w:keepNext/>
-        <w:spacing w:before="280" w:after="120"/>
+        <w:spacing w:before="200" w:after="80"/>
       </w:pPr>
       <w:r>
         <w:rPr>
           <w:rFonts w:ascii="Arial" w:hAnsi="Arial"/>
           <w:b/>
           <w:color w:val="0F172A"/>
-          <w:sz w:val="26"/>
+          <w:sz w:val="22"/>
         </w:rPr>
-        <w:t>SECTION 4: Quality of Revenue &amp; Operations</w:t>
+        <w:t>Q9. What happens if your best salesperson resigns tomorrow?</w:t>
       </w:r>
     </w:p>
     <w:p>
+      <w:r>
+        <w:rPr>
+          <w:i/>
+          <w:color w:val="64748B"/>
+        </w:rPr>
+        <w:t>Context: This tells a buyer whether the sales system belongs to the business or lives in one person's head.</w:t>
+      </w:r>
+    </w:p>
+    <w:p>
+      <w:pPr>
+        <w:pStyle w:val="ListBullet"/>
+      </w:pPr>
+      <w:r>
+        <w:rPr>
+          <w:b/>
+        </w:rPr>
+        <w:t xml:space="preserve">We would lose a serious chunk of revenue </w:t>
+      </w:r>
+      <w:r>
+        <w:t>(0 pts)</w:t>
+      </w:r>
+    </w:p>
+    <w:p>
+      <w:pPr>
+        <w:pStyle w:val="ListBullet"/>
+      </w:pPr>
+      <w:r>
+        <w:rPr>
+          <w:b/>
+        </w:rPr>
+        <w:t xml:space="preserve">A big drop for several months whilst we recover </w:t>
+      </w:r>
+      <w:r>
+        <w:t>(3 pts)</w:t>
+      </w:r>
+    </w:p>
+    <w:p>
+      <w:pPr>
+        <w:pStyle w:val="ListBullet"/>
+      </w:pPr>
+      <w:r>
+        <w:rPr>
+          <w:b/>
+        </w:rPr>
+        <w:t xml:space="preserve">A dip, then back to normal </w:t>
+      </w:r>
+      <w:r>
+        <w:t>(7 pts)</w:t>
+      </w:r>
+    </w:p>
+    <w:p>
+      <w:pPr>
+        <w:pStyle w:val="ListBullet"/>
+      </w:pPr>
+      <w:r>
+        <w:rPr>
+          <w:b/>
+        </w:rPr>
+        <w:t xml:space="preserve">Barely noticed, the leads and the process belong to the business </w:t>
+      </w:r>
+      <w:r>
+        <w:t>(10 pts)</w:t>
+      </w:r>
+    </w:p>
+    <w:p>
       <w:pPr>
         <w:keepNext/>
-        <w:spacing w:before="200" w:after="80"/>
+        <w:spacing w:before="280" w:after="120"/>
       </w:pPr>
       <w:r>
         <w:rPr>
           <w:rFonts w:ascii="Arial" w:hAnsi="Arial"/>
           <w:b/>
           <w:color w:val="0F172A"/>
-          <w:sz w:val="23"/>
+          <w:sz w:val="25"/>
         </w:rPr>
-        <w:t>Question 10: What portion of your sales comes from automatic subscriptions or hard contracts?</w:t>
+        <w:t>Section 4: Quality of the earnings</w:t>
+      </w:r>
+    </w:p>
+    <w:p>
+      <w:pPr>
+        <w:keepNext/>
+        <w:spacing w:before="200" w:after="80"/>
+      </w:pPr>
+      <w:r>
+        <w:rPr>
+          <w:rFonts w:ascii="Arial" w:hAnsi="Arial"/>
+          <w:b/>
+          <w:color w:val="0F172A"/>
+          <w:sz w:val="22"/>
+        </w:rPr>
+        <w:t>Q10. How much of your revenue is on subscription or contract?</w:t>
       </w:r>
     </w:p>
     <w:p>
@@ -1320,7 +1374,7 @@
           <w:i/>
           <w:color w:val="64748B"/>
         </w:rPr>
-        <w:t>Subtitle / Context: Predictable, guaranteed future cash flow commands the highest valuation multiples in the M&amp;A market.</w:t>
+        <w:t>Context: Contracted income is the closest thing to guaranteed money a buyer can see, and they pay a premium for it.</w:t>
       </w:r>
     </w:p>
     <w:p>
@@ -1331,7 +1385,7 @@
         <w:rPr>
           <w:b/>
         </w:rPr>
-        <w:t xml:space="preserve">None (100% transactional) </w:t>
+        <w:t xml:space="preserve">None, every sale starts from scratch </w:t>
       </w:r>
       <w:r>
         <w:t>(0 pts)</w:t>
@@ -1376,55 +1430,9 @@
         <w:t xml:space="preserve">Over 50% </w:t>
       </w:r>
       <w:r>
-        <w:t>(12 pts)</w:t>
+        <w:t>(12 pts, adds 0.5x to multiple)</w:t>
       </w:r>
     </w:p>
-    <w:tbl>
-      <w:tblPr>
-        <w:tblW w:type="auto" w:w="0"/>
-        <w:jc w:val="center"/>
-        <w:tblLook w:firstColumn="1" w:firstRow="1" w:lastColumn="0" w:lastRow="0" w:noHBand="0" w:noVBand="1" w:val="04A0"/>
-      </w:tblPr>
-      <w:tblGrid>
-        <w:gridCol w:w="9360"/>
-      </w:tblGrid>
-      <w:tr>
-        <w:tc>
-          <w:tcPr>
-            <w:tcW w:type="dxa" w:w="9360"/>
-            <w:shd w:fill="F0F9FF"/>
-            <w:tcBorders>
-              <w:top w:val="none"/>
-              <w:left w:val="single" w:sz="24" w:space="0" w:color="2ABAD2"/>
-              <w:bottom w:val="none"/>
-              <w:right w:val="none"/>
-            </w:tcBorders>
-          </w:tcPr>
-          <w:p>
-            <w:pPr>
-              <w:spacing w:before="80" w:after="80"/>
-            </w:pPr>
-            <w:r>
-              <w:rPr>
-                <w:b/>
-                <w:color w:val="0F172A"/>
-                <w:sz w:val="22"/>
-              </w:rPr>
-              <w:t>Backend Logic Rule:</w:t>
-              <w:br/>
-            </w:r>
-            <w:r>
-              <w:rPr>
-                <w:color w:val="0F172A"/>
-                <w:sz w:val="21"/>
-              </w:rPr>
-              <w:t>Selecting Over 50% applies a 1.15x Multiplier to your total running score! Buyers pay top valuation premiums for contracted future cash flow.</w:t>
-            </w:r>
-          </w:p>
-        </w:tc>
-      </w:tr>
-    </w:tbl>
-    <w:p/>
     <w:p>
       <w:pPr>
         <w:keepNext/>
@@ -1435,9 +1443,9 @@
           <w:rFonts w:ascii="Arial" w:hAnsi="Arial"/>
           <w:b/>
           <w:color w:val="0F172A"/>
-          <w:sz w:val="23"/>
+          <w:sz w:val="22"/>
         </w:rPr>
-        <w:t>Question 11: How would your customers react to a 10% price increase tomorrow?</w:t>
+        <w:t>Q11. How would your customers react to a 10% price rise tomorrow?</w:t>
       </w:r>
     </w:p>
     <w:p>
@@ -1446,7 +1454,7 @@
           <w:i/>
           <w:color w:val="64748B"/>
         </w:rPr>
-        <w:t>Subtitle / Context: Pricing power demonstrates customer retention, brand defensibility, and competitive moat.</w:t>
+        <w:t>Context: If you can put prices up without losing people, you have something they cannot get elsewhere.</w:t>
       </w:r>
     </w:p>
     <w:p>
@@ -1457,7 +1465,7 @@
         <w:rPr>
           <w:b/>
         </w:rPr>
-        <w:t xml:space="preserve">Massive customer defection </w:t>
+        <w:t xml:space="preserve">We would lose a lot of them </w:t>
       </w:r>
       <w:r>
         <w:t>(0 pts)</w:t>
@@ -1471,7 +1479,7 @@
         <w:rPr>
           <w:b/>
         </w:rPr>
-        <w:t xml:space="preserve">Heavy complaints with some customer churn </w:t>
+        <w:t xml:space="preserve">Plenty of complaints and some would go </w:t>
       </w:r>
       <w:r>
         <w:t>(3 pts)</w:t>
@@ -1485,7 +1493,7 @@
         <w:rPr>
           <w:b/>
         </w:rPr>
-        <w:t xml:space="preserve">Minor complaints but mostly high customer retention </w:t>
+        <w:t xml:space="preserve">Some grumbling, most would stay </w:t>
       </w:r>
       <w:r>
         <w:t>(7 pts)</w:t>
@@ -1499,7 +1507,7 @@
         <w:rPr>
           <w:b/>
         </w:rPr>
-        <w:t xml:space="preserve">Zero pushback because the product is highly specialized </w:t>
+        <w:t xml:space="preserve">Nobody would blink </w:t>
       </w:r>
       <w:r>
         <w:t>(10 pts)</w:t>
@@ -1515,9 +1523,9 @@
           <w:rFonts w:ascii="Arial" w:hAnsi="Arial"/>
           <w:b/>
           <w:color w:val="0F172A"/>
-          <w:sz w:val="23"/>
+          <w:sz w:val="22"/>
         </w:rPr>
-        <w:t>Question 12: How do your gross margins compare to your industry average?</w:t>
+        <w:t>Q12. How do your gross margins compare with others in your sector?</w:t>
       </w:r>
     </w:p>
     <w:p>
@@ -1526,7 +1534,7 @@
           <w:i/>
           <w:color w:val="64748B"/>
         </w:rPr>
-        <w:t>Subtitle / Context: Superior gross margins prove pricing leverage and protect profits during economic contractions.</w:t>
+        <w:t>Context: Margin above your sector average tells a buyer you have pricing power and room to absorb a bad year.</w:t>
       </w:r>
     </w:p>
     <w:p>
@@ -1537,7 +1545,7 @@
         <w:rPr>
           <w:b/>
         </w:rPr>
-        <w:t xml:space="preserve">Significantly lower than industry average </w:t>
+        <w:t xml:space="preserve">Well below average </w:t>
       </w:r>
       <w:r>
         <w:t>(0 pts)</w:t>
@@ -1551,7 +1559,7 @@
         <w:rPr>
           <w:b/>
         </w:rPr>
-        <w:t xml:space="preserve">Slightly lower than industry average </w:t>
+        <w:t xml:space="preserve">Slightly below </w:t>
       </w:r>
       <w:r>
         <w:t>(3 pts)</w:t>
@@ -1565,7 +1573,7 @@
         <w:rPr>
           <w:b/>
         </w:rPr>
-        <w:t xml:space="preserve">About the same as industry average </w:t>
+        <w:t xml:space="preserve">About the same </w:t>
       </w:r>
       <w:r>
         <w:t>(7 pts)</w:t>
@@ -1579,7 +1587,7 @@
         <w:rPr>
           <w:b/>
         </w:rPr>
-        <w:t xml:space="preserve">Significantly higher than industry average </w:t>
+        <w:t xml:space="preserve">Well above average </w:t>
       </w:r>
       <w:r>
         <w:t>(10 pts)</w:t>
@@ -1595,9 +1603,9 @@
           <w:rFonts w:ascii="Arial" w:hAnsi="Arial"/>
           <w:b/>
           <w:color w:val="0F172A"/>
-          <w:sz w:val="23"/>
+          <w:sz w:val="22"/>
         </w:rPr>
-        <w:t>Question 13: When do your customers typically pay for your goods or services?</w:t>
+        <w:t>Q13. When do your customers pay you?</w:t>
       </w:r>
     </w:p>
     <w:p>
@@ -1606,7 +1614,7 @@
           <w:i/>
           <w:color w:val="64748B"/>
         </w:rPr>
-        <w:t>Subtitle / Context: Negative working capital cycles eliminate buyer debt burden and drastically increase enterprise value.</w:t>
+        <w:t>Context: Getting paid before you deliver means a buyer needs less cash to run the place, and that shows up in the price.</w:t>
       </w:r>
     </w:p>
     <w:p>
@@ -1617,7 +1625,7 @@
         <w:rPr>
           <w:b/>
         </w:rPr>
-        <w:t xml:space="preserve">Net 60 days or more </w:t>
+        <w:t xml:space="preserve">60 days or more </w:t>
       </w:r>
       <w:r>
         <w:t>(0 pts)</w:t>
@@ -1631,7 +1639,7 @@
         <w:rPr>
           <w:b/>
         </w:rPr>
-        <w:t xml:space="preserve">Net 30 days </w:t>
+        <w:t xml:space="preserve">30 days </w:t>
       </w:r>
       <w:r>
         <w:t>(3 pts)</w:t>
@@ -1645,7 +1653,7 @@
         <w:rPr>
           <w:b/>
         </w:rPr>
-        <w:t xml:space="preserve">Upon delivery </w:t>
+        <w:t xml:space="preserve">On delivery </w:t>
       </w:r>
       <w:r>
         <w:t>(6 pts)</w:t>
@@ -1659,7 +1667,7 @@
         <w:rPr>
           <w:b/>
         </w:rPr>
-        <w:t xml:space="preserve">Upfront before delivery </w:t>
+        <w:t xml:space="preserve">Upfront, before we do the work </w:t>
       </w:r>
       <w:r>
         <w:t>(10 pts)</w:t>
@@ -1675,9 +1683,9 @@
           <w:rFonts w:ascii="Arial" w:hAnsi="Arial"/>
           <w:b/>
           <w:color w:val="0F172A"/>
-          <w:sz w:val="23"/>
+          <w:sz w:val="22"/>
         </w:rPr>
-        <w:t>Question 14: How likely are your customers to refer a friend or leave a positive review?</w:t>
+        <w:t>Q14. How likely are your customers to recommend you?</w:t>
       </w:r>
     </w:p>
     <w:p>
@@ -1686,7 +1694,7 @@
           <w:i/>
           <w:color w:val="64748B"/>
         </w:rPr>
-        <w:t>Subtitle / Context: Customer loyalty indicates organic word-of-mouth momentum and lowers customer acquisition costs for acquirers.</w:t>
+        <w:t>Context: Customers who bring you more customers keep your acquisition cost down, and a buyer will notice.</w:t>
       </w:r>
     </w:p>
     <w:p>
@@ -1711,7 +1719,7 @@
         <w:rPr>
           <w:b/>
         </w:rPr>
-        <w:t xml:space="preserve">Somewhat unlikely </w:t>
+        <w:t xml:space="preserve">Unlikely </w:t>
       </w:r>
       <w:r>
         <w:t>(3 pts)</w:t>
@@ -1725,7 +1733,7 @@
         <w:rPr>
           <w:b/>
         </w:rPr>
-        <w:t xml:space="preserve">Neutral </w:t>
+        <w:t xml:space="preserve">Neither one way nor the other </w:t>
       </w:r>
       <w:r>
         <w:t>(6 pts)</w:t>
@@ -1739,7 +1747,7 @@
         <w:rPr>
           <w:b/>
         </w:rPr>
-        <w:t xml:space="preserve">Highly likely (Strong NPS) </w:t>
+        <w:t xml:space="preserve">Very likely, they do it already </w:t>
       </w:r>
       <w:r>
         <w:t>(10 pts)</w:t>
@@ -1755,9 +1763,9 @@
           <w:rFonts w:ascii="Arial" w:hAnsi="Arial"/>
           <w:b/>
           <w:color w:val="0F172A"/>
-          <w:sz w:val="23"/>
+          <w:sz w:val="22"/>
         </w:rPr>
-        <w:t>Question 15: How are your business financial records maintained?</w:t>
+        <w:t>Q15. How are your accounts kept?</w:t>
       </w:r>
     </w:p>
     <w:p>
@@ -1766,7 +1774,7 @@
           <w:i/>
           <w:color w:val="64748B"/>
         </w:rPr>
-        <w:t>Subtitle / Context: Clean, verified financial records shorten diligence timelines and prevent buyers from chipping away at your price.</w:t>
+        <w:t>Context: Messy books give a buyer an excuse to chip away at your price during due diligence, and they will take it.</w:t>
       </w:r>
     </w:p>
     <w:p>
@@ -1777,7 +1785,7 @@
         <w:rPr>
           <w:b/>
         </w:rPr>
-        <w:t xml:space="preserve">No standard bookkeeping / shoebox accounting </w:t>
+        <w:t xml:space="preserve">Shoebox, or whatever the accountant can piece together </w:t>
       </w:r>
       <w:r>
         <w:t>(0 pts)</w:t>
@@ -1791,7 +1799,7 @@
         <w:rPr>
           <w:b/>
         </w:rPr>
-        <w:t xml:space="preserve">Standard internal software (e.g., QuickBooks, Xero) </w:t>
+        <w:t xml:space="preserve">Xero or QuickBooks, kept up to date </w:t>
       </w:r>
       <w:r>
         <w:t>(4 pts)</w:t>
@@ -1805,7 +1813,7 @@
         <w:rPr>
           <w:b/>
         </w:rPr>
-        <w:t xml:space="preserve">External CPA compilation &amp; tax returns </w:t>
+        <w:t xml:space="preserve">Accountant prepared and filed each year </w:t>
       </w:r>
       <w:r>
         <w:t>(7 pts)</w:t>
@@ -1819,10 +1827,105 @@
         <w:rPr>
           <w:b/>
         </w:rPr>
-        <w:t xml:space="preserve">Full audited financials by independent accounting firm </w:t>
-      </w:r>
-      <w:r>
-        <w:t>(10 pts - Unlocks highest valuation tier)</w:t>
+        <w:t xml:space="preserve">Fully audited by an independent firm </w:t>
+      </w:r>
+      <w:r>
+        <w:t>(10 pts)</w:t>
+      </w:r>
+    </w:p>
+    <w:p>
+      <w:pPr>
+        <w:keepNext/>
+        <w:spacing w:before="280" w:after="120"/>
+      </w:pPr>
+      <w:r>
+        <w:rPr>
+          <w:rFonts w:ascii="Arial" w:hAnsi="Arial"/>
+          <w:b/>
+          <w:color w:val="0F172A"/>
+          <w:sz w:val="25"/>
+        </w:rPr>
+        <w:t>Section 5: You</w:t>
+      </w:r>
+    </w:p>
+    <w:p>
+      <w:pPr>
+        <w:keepNext/>
+        <w:spacing w:before="200" w:after="80"/>
+      </w:pPr>
+      <w:r>
+        <w:rPr>
+          <w:rFonts w:ascii="Arial" w:hAnsi="Arial"/>
+          <w:b/>
+          <w:color w:val="0F172A"/>
+          <w:sz w:val="22"/>
+        </w:rPr>
+        <w:t>Q16. When do you want to be out?</w:t>
+      </w:r>
+    </w:p>
+    <w:p>
+      <w:r>
+        <w:rPr>
+          <w:i/>
+          <w:color w:val="64748B"/>
+        </w:rPr>
+        <w:t>Context: This one carries no points. It changes what I would tell you to do first.</w:t>
+      </w:r>
+    </w:p>
+    <w:p>
+      <w:pPr>
+        <w:pStyle w:val="ListBullet"/>
+      </w:pPr>
+      <w:r>
+        <w:rPr>
+          <w:b/>
+        </w:rPr>
+        <w:t xml:space="preserve">Inside twelve months </w:t>
+      </w:r>
+      <w:r>
+        <w:t>(0 pts, routes to call)</w:t>
+      </w:r>
+    </w:p>
+    <w:p>
+      <w:pPr>
+        <w:pStyle w:val="ListBullet"/>
+      </w:pPr>
+      <w:r>
+        <w:rPr>
+          <w:b/>
+        </w:rPr>
+        <w:t xml:space="preserve">One to three years </w:t>
+      </w:r>
+      <w:r>
+        <w:t>(0 pts, routes by tier)</w:t>
+      </w:r>
+    </w:p>
+    <w:p>
+      <w:pPr>
+        <w:pStyle w:val="ListBullet"/>
+      </w:pPr>
+      <w:r>
+        <w:rPr>
+          <w:b/>
+        </w:rPr>
+        <w:t xml:space="preserve">Three to five years </w:t>
+      </w:r>
+      <w:r>
+        <w:t>(0 pts, routes by tier)</w:t>
+      </w:r>
+    </w:p>
+    <w:p>
+      <w:pPr>
+        <w:pStyle w:val="ListBullet"/>
+      </w:pPr>
+      <w:r>
+        <w:rPr>
+          <w:b/>
+        </w:rPr>
+        <w:t xml:space="preserve">No fixed plan, I just want to know where I stand </w:t>
+      </w:r>
+      <w:r>
+        <w:t>(0 pts, routes by tier)</w:t>
       </w:r>
     </w:p>
     <w:p>
@@ -1835,9 +1938,9 @@
           <w:rFonts w:ascii="Arial" w:hAnsi="Arial"/>
           <w:b/>
           <w:color w:val="2ABAD2"/>
-          <w:sz w:val="32"/>
+          <w:sz w:val="30"/>
         </w:rPr>
-        <w:t>3. Valuation Multiplier &amp; Gap Engine</w:t>
+        <w:t>3. Valuation Engine</w:t>
       </w:r>
     </w:p>
     <w:tbl>
@@ -1869,33 +1972,31 @@
               <w:rPr>
                 <w:b/>
                 <w:color w:val="0F172A"/>
-                <w:sz w:val="22"/>
+                <w:sz w:val="21"/>
               </w:rPr>
-              <w:t>Valuation Calculation Model:</w:t>
+              <w:t>8-Step Calculation Workflow:</w:t>
               <w:br/>
             </w:r>
             <w:r>
               <w:rPr>
                 <w:color w:val="0F172A"/>
-                <w:sz w:val="21"/>
+                <w:sz w:val="20"/>
               </w:rPr>
-              <w:t>• Baseline EBITDA = Revenue Estimate (Q1) × Net Margin Estimate (Q2)</w:t>
+              <w:t>1. Earnings: Adjusted EBITDA = revenue estimate from Q1 x margin estimate from Q2</w:t>
               <w:br/>
-              <w:t>• Current Multiple Tiers:</w:t>
+              <w:t>2. Score: (raw points / 174) x 100, clamped 0 to 100, then apply Q3 cap of 55 if it fires</w:t>
               <w:br/>
-              <w:t xml:space="preserve">   - Score 0–50: ~2.0x EBITDA (Owner-Dependent Job)</w:t>
+              <w:t>3. Base multiple: 0 to 39.9 = 2.0x, 40 to 61.9 = 3.8x, 62 to 79.9 = 5.8x, 80 to 100 = 8.5x</w:t>
               <w:br/>
-              <w:t xml:space="preserve">   - Score 51–70: ~3.8x EBITDA (Sellable with Discounts)</w:t>
+              <w:t>4. Recurring uplift: Add 0.5x if Q10 = over 50%</w:t>
               <w:br/>
-              <w:t xml:space="preserve">   - Score 71–89: ~5.8x EBITDA (Marketable Asset)</w:t>
+              <w:t>5. Size cap: Under 1m capped at 4.0x, 1m to 3m at 5.5x, 3m to 10m at 7.0x, over 10m at 8.5x</w:t>
               <w:br/>
-              <w:t xml:space="preserve">   - Score 90–100: ~8.5x EBITDA (Premium Exit Asset)</w:t>
+              <w:t>6. Today's value: Adjusted EBITDA x final multiple</w:t>
               <w:br/>
-              <w:t>• Estimated Current Valuation = Baseline EBITDA × Current Multiple</w:t>
+              <w:t>7. Ceiling: Adjusted EBITDA x the size cap for their revenue band</w:t>
               <w:br/>
-              <w:t>• Tier-90+ Exit Potential = Baseline EBITDA × 8.5x Multiple</w:t>
-              <w:br/>
-              <w:t>• The Valuation Gap = Potential Valuation − Current Valuation (Money left on the table)</w:t>
+              <w:t>8. The gap: Ceiling minus today's value</w:t>
             </w:r>
           </w:p>
         </w:tc>
@@ -1912,9 +2013,9 @@
           <w:rFonts w:ascii="Arial" w:hAnsi="Arial"/>
           <w:b/>
           <w:color w:val="2ABAD2"/>
-          <w:sz w:val="32"/>
+          <w:sz w:val="30"/>
         </w:rPr>
-        <w:t>4. Dynamic #1 Value Killer Diagnostics</w:t>
+        <w:t>4. The Number One Value Killer (Ordered Priority)</w:t>
       </w:r>
     </w:p>
     <w:p>
@@ -1927,9 +2028,9 @@
           <w:rFonts w:ascii="Arial" w:hAnsi="Arial"/>
           <w:b/>
           <w:color w:val="0F172A"/>
-          <w:sz w:val="26"/>
+          <w:sz w:val="25"/>
         </w:rPr>
-        <w:t>1. Founder Trap (Severe Key-Person Risk)</w:t>
+        <w:t>1. You are the business</w:t>
       </w:r>
     </w:p>
     <w:p>
@@ -1940,7 +2041,7 @@
         <w:t xml:space="preserve">Trigger: </w:t>
       </w:r>
       <w:r>
-        <w:t>Q5 = Sales drop to zero if owner leaves for 3 months</w:t>
+        <w:t>Q5 = sales stop</w:t>
       </w:r>
     </w:p>
     <w:p>
@@ -1948,10 +2049,10 @@
         <w:rPr>
           <w:b/>
         </w:rPr>
-        <w:t xml:space="preserve">Valuation Impact: </w:t>
-      </w:r>
-      <w:r>
-        <w:t>Cuts EBITDA multiple by up to 50% &amp; triggers grueling 3–5 year earnouts</w:t>
+        <w:t xml:space="preserve">What it costs: </w:t>
+      </w:r>
+      <w:r>
+        <w:t>Halves the multiple and puts you on an earn out for three to five years</w:t>
       </w:r>
     </w:p>
     <w:p>
@@ -1962,7 +2063,7 @@
         <w:t xml:space="preserve">Diagnosis: </w:t>
       </w:r>
       <w:r>
-        <w:t>Sales drop to zero if you step away. In M&amp;A, buyers do not buy jobs — they buy self-sustaining cash flow engines. Institutional buyers will pass immediately or demand a multi-year earnout tied to your personal presence.</w:t>
+        <w:t>Sales stop if you step away for three months, which means the business is you, and nobody can buy you. A trade buyer will walk. A private equity buyer will make you an offer with most of the money tied to an earn out that keeps you working for another three to five years to collect it.</w:t>
       </w:r>
     </w:p>
     <w:p>
@@ -1970,10 +2071,10 @@
         <w:rPr>
           <w:b/>
         </w:rPr>
-        <w:t xml:space="preserve">Tactical Remedy: </w:t>
-      </w:r>
-      <w:r>
-        <w:t>Immediately build documented SOPs and install a second-in-command who owns customer fulfillment and sales pipelines.</w:t>
+        <w:t xml:space="preserve">What to do about it: </w:t>
+      </w:r>
+      <w:r>
+        <w:t>Write down how the work gets done, one process at a time. Hand your ten biggest accounts to somebody else over the next six months. Get one person owning delivery and one owning the pipeline, and stay out of both.</w:t>
       </w:r>
     </w:p>
     <w:p/>
@@ -1987,9 +2088,9 @@
           <w:rFonts w:ascii="Arial" w:hAnsi="Arial"/>
           <w:b/>
           <w:color w:val="0F172A"/>
-          <w:sz w:val="26"/>
+          <w:sz w:val="25"/>
         </w:rPr>
-        <w:t>2. Severe Customer Concentration (&gt;30% Revenue)</w:t>
+        <w:t>2. One customer holds the keys</w:t>
       </w:r>
     </w:p>
     <w:p>
@@ -2000,7 +2101,7 @@
         <w:t xml:space="preserve">Trigger: </w:t>
       </w:r>
       <w:r>
-        <w:t>Q7 = Over 30% of revenue in single largest account</w:t>
+        <w:t>Q7 = over 30%</w:t>
       </w:r>
     </w:p>
     <w:p>
@@ -2008,10 +2109,10 @@
         <w:rPr>
           <w:b/>
         </w:rPr>
-        <w:t xml:space="preserve">Valuation Impact: </w:t>
-      </w:r>
-      <w:r>
-        <w:t>Triggers 2.0x–3.0x multiple penalty and bank acquisition financing refusal</w:t>
+        <w:t xml:space="preserve">What it costs: </w:t>
+      </w:r>
+      <w:r>
+        <w:t>Two to three turns off the multiple, and most lenders will not fund the deal at all</w:t>
       </w:r>
     </w:p>
     <w:p>
@@ -2022,7 +2123,7 @@
         <w:t xml:space="preserve">Diagnosis: </w:t>
       </w:r>
       <w:r>
-        <w:t>A single client generates over 30% of turnover. If that customer churns post-sale, the buyer's debt service collapses. Bank lenders often refuse to finance acquisitions with over 25% single-customer exposure.</w:t>
+        <w:t>More than thirty percent of your turnover sits in one account. Ask yourself what happens to a buyer if that client leaves the month after completion, because the buyer's bank will ask exactly that, and most lenders refuse to fund a deal with more than a quarter of revenue in one place.</w:t>
       </w:r>
     </w:p>
     <w:p>
@@ -2030,10 +2131,10 @@
         <w:rPr>
           <w:b/>
         </w:rPr>
-        <w:t xml:space="preserve">Tactical Remedy: </w:t>
-      </w:r>
-      <w:r>
-        <w:t>Lock this major customer into a multi-year SLA and execute a targeted sales sprint to dilute their share below 15%.</w:t>
+        <w:t xml:space="preserve">What to do about it: </w:t>
+      </w:r>
+      <w:r>
+        <w:t>Get that client onto a multi year agreement with proper notice periods, and put a serious push behind new business until they sit under fifteen percent. Both jobs, not one or the other.</w:t>
       </w:r>
     </w:p>
     <w:p/>
@@ -2047,9 +2148,9 @@
           <w:rFonts w:ascii="Arial" w:hAnsi="Arial"/>
           <w:b/>
           <w:color w:val="0F172A"/>
-          <w:sz w:val="26"/>
+          <w:sz w:val="25"/>
         </w:rPr>
-        <w:t>3. Contracting Revenue Trajectory</w:t>
+        <w:t>3. The line is going backwards</w:t>
       </w:r>
     </w:p>
     <w:p>
@@ -2060,7 +2161,7 @@
         <w:t xml:space="preserve">Trigger: </w:t>
       </w:r>
       <w:r>
-        <w:t>Q3 = Declining YoY growth</w:t>
+        <w:t>Q3 = declining</w:t>
       </w:r>
     </w:p>
     <w:p>
@@ -2068,10 +2169,10 @@
         <w:rPr>
           <w:b/>
         </w:rPr>
-        <w:t xml:space="preserve">Valuation Impact: </w:t>
-      </w:r>
-      <w:r>
-        <w:t>Hard score cap at 70/100 &amp; heavy distressed acquisition discounts</w:t>
+        <w:t xml:space="preserve">What it costs: </w:t>
+      </w:r>
+      <w:r>
+        <w:t>Score capped at 55 and a turnaround discount on top</w:t>
       </w:r>
     </w:p>
     <w:p>
@@ -2082,7 +2183,7 @@
         <w:t xml:space="preserve">Diagnosis: </w:t>
       </w:r>
       <w:r>
-        <w:t>Your top-line revenue is shrinking year-over-year. Buyers purchase future cash flow, not historical nostalgia. A declining business is treated as a turnaround risk, slashing multiples.</w:t>
+        <w:t>Turnover is going backwards. Buyers price the next three years, and a falling line tells them the next three are worse than the last three. They will treat you as a turnaround and pay you like one, if they bid at all. Fix the direction before you go anywhere near a broker.</w:t>
       </w:r>
     </w:p>
     <w:p>
@@ -2090,10 +2191,310 @@
         <w:rPr>
           <w:b/>
         </w:rPr>
-        <w:t xml:space="preserve">Tactical Remedy: </w:t>
-      </w:r>
-      <w:r>
-        <w:t>Eliminate low-margin product lines, restructure pricing, and establish 2 consecutive quarters of growth stabilization before going to market.</w:t>
+        <w:t xml:space="preserve">What to do about it: </w:t>
+      </w:r>
+      <w:r>
+        <w:t>Cut the lines that make no money, put prices up where the market lets you, and get two consecutive quarters of growth on the board before you speak to a single buyer.</w:t>
+      </w:r>
+    </w:p>
+    <w:p/>
+    <w:p>
+      <w:pPr>
+        <w:keepNext/>
+        <w:spacing w:before="280" w:after="120"/>
+      </w:pPr>
+      <w:r>
+        <w:rPr>
+          <w:rFonts w:ascii="Arial" w:hAnsi="Arial"/>
+          <w:b/>
+          <w:color w:val="0F172A"/>
+          <w:sz w:val="25"/>
+        </w:rPr>
+        <w:t>4. The numbers do not work</w:t>
+      </w:r>
+    </w:p>
+    <w:p>
+      <w:r>
+        <w:rPr>
+          <w:b/>
+        </w:rPr>
+        <w:t xml:space="preserve">Trigger: </w:t>
+      </w:r>
+      <w:r>
+        <w:t>Q2 = negative/breakeven and Q2B = structural problems</w:t>
+      </w:r>
+    </w:p>
+    <w:p>
+      <w:r>
+        <w:rPr>
+          <w:b/>
+        </w:rPr>
+        <w:t xml:space="preserve">What it costs: </w:t>
+      </w:r>
+      <w:r>
+        <w:t>No earnings multiple applies. Asset value only</w:t>
+      </w:r>
+    </w:p>
+    <w:p>
+      <w:r>
+        <w:rPr>
+          <w:b/>
+        </w:rPr>
+        <w:t xml:space="preserve">Diagnosis: </w:t>
+      </w:r>
+      <w:r>
+        <w:t>The business is not making money and you have told me the reason is structural rather than deliberate. There is no earnings multiple to apply to a business that does not earn, so the only offer on the table would be for the assets. That is a business problem before it is an exit problem.</w:t>
+      </w:r>
+    </w:p>
+    <w:p>
+      <w:r>
+        <w:rPr>
+          <w:b/>
+        </w:rPr>
+        <w:t xml:space="preserve">What to do about it: </w:t>
+      </w:r>
+      <w:r>
+        <w:t>Work out which customers and which product lines make you money, and be willing to lose the ones that do not. Get to a positive number for two quarters before anything else on this list matters.</w:t>
+      </w:r>
+    </w:p>
+    <w:p/>
+    <w:p>
+      <w:pPr>
+        <w:keepNext/>
+        <w:spacing w:before="280" w:after="120"/>
+      </w:pPr>
+      <w:r>
+        <w:rPr>
+          <w:rFonts w:ascii="Arial" w:hAnsi="Arial"/>
+          <w:b/>
+          <w:color w:val="0F172A"/>
+          <w:sz w:val="25"/>
+        </w:rPr>
+        <w:t>5. There is nobody behind you</w:t>
+      </w:r>
+    </w:p>
+    <w:p>
+      <w:r>
+        <w:rPr>
+          <w:b/>
+        </w:rPr>
+        <w:t xml:space="preserve">Trigger: </w:t>
+      </w:r>
+      <w:r>
+        <w:t>Q6 = no number two</w:t>
+      </w:r>
+    </w:p>
+    <w:p>
+      <w:r>
+        <w:rPr>
+          <w:b/>
+        </w:rPr>
+        <w:t xml:space="preserve">What it costs: </w:t>
+      </w:r>
+      <w:r>
+        <w:t>One to two turns off the multiple</w:t>
+      </w:r>
+    </w:p>
+    <w:p>
+      <w:r>
+        <w:rPr>
+          <w:b/>
+        </w:rPr>
+        <w:t xml:space="preserve">Diagnosis: </w:t>
+      </w:r>
+      <w:r>
+        <w:t>There is nobody who can run the place without you. That one hire usually moves the final price more than a year of extra sales does, and most owners leave it far too late because they cannot see how to afford it. The maths says you cannot afford not to.</w:t>
+      </w:r>
+    </w:p>
+    <w:p>
+      <w:r>
+        <w:rPr>
+          <w:b/>
+        </w:rPr>
+        <w:t xml:space="preserve">What to do about it: </w:t>
+      </w:r>
+      <w:r>
+        <w:t>Hire or promote somebody into the number two seat this quarter, give them real authority rather than the title, and let them make a few expensive mistakes whilst you are still there to catch them.</w:t>
+      </w:r>
+    </w:p>
+    <w:p/>
+    <w:p>
+      <w:pPr>
+        <w:keepNext/>
+        <w:spacing w:before="280" w:after="120"/>
+      </w:pPr>
+      <w:r>
+        <w:rPr>
+          <w:rFonts w:ascii="Arial" w:hAnsi="Arial"/>
+          <w:b/>
+          <w:color w:val="0F172A"/>
+          <w:sz w:val="25"/>
+        </w:rPr>
+        <w:t>6. Your books will not survive diligence</w:t>
+      </w:r>
+    </w:p>
+    <w:p>
+      <w:r>
+        <w:rPr>
+          <w:b/>
+        </w:rPr>
+        <w:t xml:space="preserve">Trigger: </w:t>
+      </w:r>
+      <w:r>
+        <w:t>Q15 = shoebox</w:t>
+      </w:r>
+    </w:p>
+    <w:p>
+      <w:r>
+        <w:rPr>
+          <w:b/>
+        </w:rPr>
+        <w:t xml:space="preserve">What it costs: </w:t>
+      </w:r>
+      <w:r>
+        <w:t>Five to fifteen percent knocked off during diligence, plus months of delay</w:t>
+      </w:r>
+    </w:p>
+    <w:p>
+      <w:r>
+        <w:rPr>
+          <w:b/>
+        </w:rPr>
+        <w:t xml:space="preserve">Diagnosis: </w:t>
+      </w:r>
+      <w:r>
+        <w:t>Your records will not stand up to a proper look. Every number a buyer cannot trace becomes a reason to pay you less, and buyers are very good at finding them. This is the cheapest thing on the list to fix and the one most owners put off.</w:t>
+      </w:r>
+    </w:p>
+    <w:p>
+      <w:r>
+        <w:rPr>
+          <w:b/>
+        </w:rPr>
+        <w:t xml:space="preserve">What to do about it: </w:t>
+      </w:r>
+      <w:r>
+        <w:t>Get twenty four months of clean, reconciled accounts prepared properly, separate anything personal that is running through the business, and have your accountant produce a set that a stranger could follow.</w:t>
+      </w:r>
+    </w:p>
+    <w:p/>
+    <w:p>
+      <w:pPr>
+        <w:keepNext/>
+        <w:spacing w:before="280" w:after="120"/>
+      </w:pPr>
+      <w:r>
+        <w:rPr>
+          <w:rFonts w:ascii="Arial" w:hAnsi="Arial"/>
+          <w:b/>
+          <w:color w:val="0F172A"/>
+          <w:sz w:val="25"/>
+        </w:rPr>
+        <w:t>7. Every pound has to be won again</w:t>
+      </w:r>
+    </w:p>
+    <w:p>
+      <w:r>
+        <w:rPr>
+          <w:b/>
+        </w:rPr>
+        <w:t xml:space="preserve">Trigger: </w:t>
+      </w:r>
+      <w:r>
+        <w:t>Q10 = none</w:t>
+      </w:r>
+    </w:p>
+    <w:p>
+      <w:r>
+        <w:rPr>
+          <w:b/>
+        </w:rPr>
+        <w:t xml:space="preserve">What it costs: </w:t>
+      </w:r>
+      <w:r>
+        <w:t>One to two turns off the multiple</w:t>
+      </w:r>
+    </w:p>
+    <w:p>
+      <w:r>
+        <w:rPr>
+          <w:b/>
+        </w:rPr>
+        <w:t xml:space="preserve">Diagnosis: </w:t>
+      </w:r>
+      <w:r>
+        <w:t>None of your revenue renews on its own, so every year starts at zero. Buyers pay a great deal more for income that arrives whether or not anybody sells anything, because it is the difference between buying a business and buying a treadmill.</w:t>
+      </w:r>
+    </w:p>
+    <w:p>
+      <w:r>
+        <w:rPr>
+          <w:b/>
+        </w:rPr>
+        <w:t xml:space="preserve">What to do about it: </w:t>
+      </w:r>
+      <w:r>
+        <w:t>Find the part of what you do that customers need every month, price it separately, and put your best accounts onto twelve month agreements.</w:t>
+      </w:r>
+    </w:p>
+    <w:p/>
+    <w:p>
+      <w:pPr>
+        <w:keepNext/>
+        <w:spacing w:before="280" w:after="120"/>
+      </w:pPr>
+      <w:r>
+        <w:rPr>
+          <w:rFonts w:ascii="Arial" w:hAnsi="Arial"/>
+          <w:b/>
+          <w:color w:val="0F172A"/>
+          <w:sz w:val="25"/>
+        </w:rPr>
+        <w:t>8. You cannot move your prices</w:t>
+      </w:r>
+    </w:p>
+    <w:p>
+      <w:r>
+        <w:rPr>
+          <w:b/>
+        </w:rPr>
+        <w:t xml:space="preserve">Trigger: </w:t>
+      </w:r>
+      <w:r>
+        <w:t>Q11 = we would lose a lot of them</w:t>
+      </w:r>
+    </w:p>
+    <w:p>
+      <w:r>
+        <w:rPr>
+          <w:b/>
+        </w:rPr>
+        <w:t xml:space="preserve">What it costs: </w:t>
+      </w:r>
+      <w:r>
+        <w:t>Signals a commodity position, which caps the multiple</w:t>
+      </w:r>
+    </w:p>
+    <w:p>
+      <w:r>
+        <w:rPr>
+          <w:b/>
+        </w:rPr>
+        <w:t xml:space="preserve">Diagnosis: </w:t>
+      </w:r>
+      <w:r>
+        <w:t>A ten percent price rise would cost you customers, which tells a buyer you are competing on price against people who can undercut you. That caps what anybody will pay, because they can see the margin has nowhere to go.</w:t>
+      </w:r>
+    </w:p>
+    <w:p>
+      <w:r>
+        <w:rPr>
+          <w:b/>
+        </w:rPr>
+        <w:t xml:space="preserve">What to do about it: </w:t>
+      </w:r>
+      <w:r>
+        <w:t>Work out what you do that the cheap option does not, put it in front of customers, and test a price rise on your ten best accounts before you touch the rest.</w:t>
       </w:r>
     </w:p>
     <w:p/>
@@ -2107,9 +2508,9 @@
           <w:rFonts w:ascii="Arial" w:hAnsi="Arial"/>
           <w:b/>
           <w:color w:val="2ABAD2"/>
-          <w:sz w:val="32"/>
+          <w:sz w:val="30"/>
         </w:rPr>
-        <w:t>5. Outcome Tiers &amp; Actionable Recommendations</w:t>
+        <w:t>5. Result Tiers</w:t>
       </w:r>
     </w:p>
     <w:p>
@@ -2122,9 +2523,9 @@
           <w:rFonts w:ascii="Arial" w:hAnsi="Arial"/>
           <w:b/>
           <w:color w:val="0F172A"/>
-          <w:sz w:val="26"/>
+          <w:sz w:val="25"/>
         </w:rPr>
-        <w:t>TIER 1: Owner-Dependent Job Warning (Score 0 – 50 • ~2.0x EBITDA)</w:t>
+        <w:t>Tier 1. You own a job (Score 0 to 39.9, around 2.0x)</w:t>
       </w:r>
     </w:p>
     <w:p>
@@ -2135,7 +2536,7 @@
         <w:t xml:space="preserve">Headline: </w:t>
       </w:r>
       <w:r>
-        <w:t>High Founder Dependency — Action Plan to Build Your SOP Infrastructure</w:t>
+        <w:t>Right now a buyer sees a demanding job with your name on it</w:t>
       </w:r>
     </w:p>
     <w:p>
@@ -2146,7 +2547,7 @@
         <w:t xml:space="preserve">Description: </w:t>
       </w:r>
       <w:r>
-        <w:t>Acquirers look for businesses that run smoothly without the founder. At your current score, a buyer would view purchasing your business as buying a demanding job rather than a self-sustaining asset.</w:t>
+        <w:t>Buyers want a business that runs whether or not you turn up. At this score they would be buying themselves a job, and most of them already have one. That is a fixable problem, and it is the one owners fix too late. The work below is unglamorous, it takes six to twelve months, and it moves your number more than any sales push will.</w:t>
       </w:r>
     </w:p>
     <w:p>
@@ -2159,9 +2560,9 @@
           <w:rFonts w:ascii="Arial" w:hAnsi="Arial"/>
           <w:b/>
           <w:color w:val="0F172A"/>
-          <w:sz w:val="23"/>
+          <w:sz w:val="22"/>
         </w:rPr>
-        <w:t>Actionable Recommendations Roadmap:</w:t>
+        <w:t>The Roadmap:</w:t>
       </w:r>
     </w:p>
     <w:p>
@@ -2175,7 +2576,7 @@
         <w:t xml:space="preserve">Step 1: </w:t>
       </w:r>
       <w:r>
-        <w:t>Document all of your core daily operations into standardized step-by-step operating procedures (SOPs).</w:t>
+        <w:t>Write down how the core work gets done, one process at a time, starting with whatever only you know.</w:t>
       </w:r>
     </w:p>
     <w:p>
@@ -2189,7 +2590,7 @@
         <w:t xml:space="preserve">Step 2: </w:t>
       </w:r>
       <w:r>
-        <w:t>Promote or hire an operational manager to handle your day-to-day client fulfillment and team oversight.</w:t>
+        <w:t>Promote or hire somebody to run delivery and the team day to day.</w:t>
       </w:r>
     </w:p>
     <w:p>
@@ -2203,7 +2604,7 @@
         <w:t xml:space="preserve">Step 3: </w:t>
       </w:r>
       <w:r>
-        <w:t>Systematize your lead generation and sales calls so revenue isn't dependent on your personal effort.</w:t>
+        <w:t>Get leads coming in through a system rather than through your phone.</w:t>
       </w:r>
     </w:p>
     <w:p>
@@ -2217,7 +2618,7 @@
         <w:t xml:space="preserve">Step 4: </w:t>
       </w:r>
       <w:r>
-        <w:t>Transition your key client relationships to your team members over a 6-month period.</w:t>
+        <w:t>Move your key client relationships onto your people over six months, and stay off the calls.</w:t>
       </w:r>
     </w:p>
     <w:p/>
@@ -2231,9 +2632,9 @@
           <w:rFonts w:ascii="Arial" w:hAnsi="Arial"/>
           <w:b/>
           <w:color w:val="0F172A"/>
-          <w:sz w:val="26"/>
+          <w:sz w:val="25"/>
         </w:rPr>
-        <w:t>TIER 2: High-Risk Asset with Potential (Score 51 – 70 • ~3.8x EBITDA)</w:t>
+        <w:t>Tier 2. Sellable, and the price gets chipped (Score 40 to 61.9, around 3.8x)</w:t>
       </w:r>
     </w:p>
     <w:p>
@@ -2244,7 +2645,7 @@
         <w:t xml:space="preserve">Headline: </w:t>
       </w:r>
       <w:r>
-        <w:t>Sellable with Valuation Discounts — Your Risk Mitigation Roadmap</w:t>
+        <w:t>You could sell this, and you would watch a buyer take money off you for six weeks</w:t>
       </w:r>
     </w:p>
     <w:p>
@@ -2255,7 +2656,7 @@
         <w:t xml:space="preserve">Description: </w:t>
       </w:r>
       <w:r>
-        <w:t>Your business is sellable, but buyers will likely apply valuation discounts to protect against key risk factors (such as customer concentration, lack of long-term contracts, or reliance on you).</w:t>
+        <w:t>There is a real business here and somebody would buy it. You would also spend the back end of the process watching a buyer knock the price down for risks you could have dealt with beforehand. Every item below is a discount you are currently handing over.</w:t>
       </w:r>
     </w:p>
     <w:p>
@@ -2268,9 +2669,9 @@
           <w:rFonts w:ascii="Arial" w:hAnsi="Arial"/>
           <w:b/>
           <w:color w:val="0F172A"/>
-          <w:sz w:val="23"/>
+          <w:sz w:val="22"/>
         </w:rPr>
-        <w:t>Actionable Recommendations Roadmap:</w:t>
+        <w:t>The Roadmap:</w:t>
       </w:r>
     </w:p>
     <w:p>
@@ -2284,7 +2685,7 @@
         <w:t xml:space="preserve">Step 1: </w:t>
       </w:r>
       <w:r>
-        <w:t>Diversify your customer base so no single client represents over 15% of your annual revenue.</w:t>
+        <w:t>Bring your largest customer under fifteen percent of turnover.</w:t>
       </w:r>
     </w:p>
     <w:p>
@@ -2298,7 +2699,7 @@
         <w:t xml:space="preserve">Step 2: </w:t>
       </w:r>
       <w:r>
-        <w:t>Lock your top accounts into 1 to 3 year binding contracts with clear renewal terms.</w:t>
+        <w:t>Get your top accounts onto one to three year agreements with clear renewal terms.</w:t>
       </w:r>
     </w:p>
     <w:p>
@@ -2312,7 +2713,7 @@
         <w:t xml:space="preserve">Step 3: </w:t>
       </w:r>
       <w:r>
-        <w:t>Formalize employee non-competes and retention incentives for your key team members.</w:t>
+        <w:t>Sort out contracts, notice periods and retention for the people a buyer would worry about losing.</w:t>
       </w:r>
     </w:p>
     <w:p>
@@ -2326,7 +2727,7 @@
         <w:t xml:space="preserve">Step 4: </w:t>
       </w:r>
       <w:r>
-        <w:t>Clean up your internal accounting records to prepare for buyer due diligence.</w:t>
+        <w:t>Clean up two years of accounts now, whilst you have time, rather than during diligence.</w:t>
       </w:r>
     </w:p>
     <w:p/>
@@ -2340,9 +2741,9 @@
           <w:rFonts w:ascii="Arial" w:hAnsi="Arial"/>
           <w:b/>
           <w:color w:val="0F172A"/>
-          <w:sz w:val="26"/>
+          <w:sz w:val="25"/>
         </w:rPr>
-        <w:t>TIER 3: Strong Valuation &amp; Highly Marketable (Score 71 – 89 • ~5.8x EBITDA)</w:t>
+        <w:t>Tier 3. Buyers will compete for this (Score 62 to 79.9, around 5.8x)</w:t>
       </w:r>
     </w:p>
     <w:p>
@@ -2353,7 +2754,7 @@
         <w:t xml:space="preserve">Headline: </w:t>
       </w:r>
       <w:r>
-        <w:t>Highly Marketable Business — You Are Ready for Competitive Offers</w:t>
+        <w:t>You have built something clean, and the job now is running a proper process</w:t>
       </w:r>
     </w:p>
     <w:p>
@@ -2364,7 +2765,7 @@
         <w:t xml:space="preserve">Description: </w:t>
       </w:r>
       <w:r>
-        <w:t>You have built a clean, scalable business with strong profit margins, solid management, and diversified revenue. Buyers will actively compete for a business with your profile.</w:t>
+        <w:t>Margins hold up, somebody else can run it, and the revenue does not hang on one client or one person. Businesses like yours get bid for. What loses money at this stage is selling to the first buyer who calls, because a single bidder sets the price and knows it.</w:t>
       </w:r>
     </w:p>
     <w:p>
@@ -2377,9 +2778,9 @@
           <w:rFonts w:ascii="Arial" w:hAnsi="Arial"/>
           <w:b/>
           <w:color w:val="0F172A"/>
-          <w:sz w:val="23"/>
+          <w:sz w:val="22"/>
         </w:rPr>
-        <w:t>Actionable Recommendations Roadmap:</w:t>
+        <w:t>The Roadmap:</w:t>
       </w:r>
     </w:p>
     <w:p>
@@ -2393,7 +2794,7 @@
         <w:t xml:space="preserve">Step 1: </w:t>
       </w:r>
       <w:r>
-        <w:t>Engage a Quality of Earnings (QofE) auditor to pre-verify your EBITDA calculations.</w:t>
+        <w:t>Get a quality of earnings review done before a buyer does one to you.</w:t>
       </w:r>
     </w:p>
     <w:p>
@@ -2407,7 +2808,7 @@
         <w:t xml:space="preserve">Step 2: </w:t>
       </w:r>
       <w:r>
-        <w:t>Optimize your recurring revenue models to convert transactional sales into subscription or long-term contracts.</w:t>
+        <w:t>Convert whatever you can from one off work to contracted income, because it is worth more than the revenue it replaces.</w:t>
       </w:r>
     </w:p>
     <w:p>
@@ -2421,7 +2822,7 @@
         <w:t xml:space="preserve">Step 3: </w:t>
       </w:r>
       <w:r>
-        <w:t>Build a clear 3-year growth narrative showing your untapped expansion channels for an acquirer.</w:t>
+        <w:t>Write the three year growth story, with the channels you have not touched yet and what they are worth.</w:t>
       </w:r>
     </w:p>
     <w:p>
@@ -2435,7 +2836,7 @@
         <w:t xml:space="preserve">Step 4: </w:t>
       </w:r>
       <w:r>
-        <w:t>Interview top M&amp;A brokers or investment bankers to structure a competitive bidding process for your exit.</w:t>
+        <w:t>Interview three advisers and pick the one who will get more than one buyer to the table.</w:t>
       </w:r>
     </w:p>
     <w:p/>
@@ -2449,9 +2850,9 @@
           <w:rFonts w:ascii="Arial" w:hAnsi="Arial"/>
           <w:b/>
           <w:color w:val="0F172A"/>
-          <w:sz w:val="26"/>
+          <w:sz w:val="25"/>
         </w:rPr>
-        <w:t>TIER 4: Premium Exit Asset (Score 90 – 100 • ~8.5x EBITDA)</w:t>
+        <w:t>Tier 4. Top of the market (Score 80 to 100, around 8.5x)</w:t>
       </w:r>
     </w:p>
     <w:p>
@@ -2462,7 +2863,7 @@
         <w:t xml:space="preserve">Headline: </w:t>
       </w:r>
       <w:r>
-        <w:t>Trophy Business Asset — You Have Achieved Elite Exit Valuation Potential</w:t>
+        <w:t>Very few owners get here</w:t>
       </w:r>
     </w:p>
     <w:p>
@@ -2473,7 +2874,7 @@
         <w:t xml:space="preserve">Description: </w:t>
       </w:r>
       <w:r>
-        <w:t>Fewer than 3% of business owners achieve this tier. Your business features autonomous management, high-margin recurring cash flows, bulletproof contracts, and clean audited financials.</w:t>
+        <w:t>The management runs it, the income renews, the books stand up and the contracts hold. Your job now is making sure you do not leave money on the table by taking the first approach that lands in your inbox, which is how most owners at your level end up underpaid.</w:t>
       </w:r>
     </w:p>
     <w:p>
@@ -2486,9 +2887,9 @@
           <w:rFonts w:ascii="Arial" w:hAnsi="Arial"/>
           <w:b/>
           <w:color w:val="0F172A"/>
-          <w:sz w:val="23"/>
+          <w:sz w:val="22"/>
         </w:rPr>
-        <w:t>Actionable Recommendations Roadmap:</w:t>
+        <w:t>The Roadmap:</w:t>
       </w:r>
     </w:p>
     <w:p>
@@ -2502,7 +2903,7 @@
         <w:t xml:space="preserve">Step 1: </w:t>
       </w:r>
       <w:r>
-        <w:t>Run a targeted private auction through a tier-1 M&amp;A advisory firm to maximize your enterprise valuation.</w:t>
+        <w:t>Run a proper private auction through an adviser who works in your sector.</w:t>
       </w:r>
     </w:p>
     <w:p>
@@ -2516,7 +2917,7 @@
         <w:t xml:space="preserve">Step 2: </w:t>
       </w:r>
       <w:r>
-        <w:t>Evaluate strategic buyers who can extract massive synergy value beyond standard market multiples.</w:t>
+        <w:t>Look hard at trade buyers who gain something from owning you, because they pay above the market rate.</w:t>
       </w:r>
     </w:p>
     <w:p>
@@ -2530,7 +2931,7 @@
         <w:t xml:space="preserve">Step 3: </w:t>
       </w:r>
       <w:r>
-        <w:t>Structure tax-optimized exit strategies (e.g. rollover equity, installment structures, asset vs stock sale).</w:t>
+        <w:t>Get the tax structuring done early, and by somebody who does this for a living.</w:t>
       </w:r>
     </w:p>
     <w:p>
@@ -2544,7 +2945,102 @@
         <w:t xml:space="preserve">Step 4: </w:t>
       </w:r>
       <w:r>
-        <w:t>Prepare key management retention packages to ensure zero disruption during your ownership transfer.</w:t>
+        <w:t>Lock in your key people with retention packages before anybody knows the business is for sale.</w:t>
+      </w:r>
+    </w:p>
+    <w:p/>
+    <w:p>
+      <w:pPr>
+        <w:keepNext/>
+        <w:spacing w:before="280" w:after="120"/>
+      </w:pPr>
+      <w:r>
+        <w:rPr>
+          <w:rFonts w:ascii="Arial" w:hAnsi="Arial"/>
+          <w:b/>
+          <w:color w:val="0F172A"/>
+          <w:sz w:val="25"/>
+        </w:rPr>
+        <w:t>Tier 4 variant (Under 1m turnover) (Score 80 to 100, 4.0x size cap)</w:t>
+      </w:r>
+    </w:p>
+    <w:p>
+      <w:r>
+        <w:rPr>
+          <w:b/>
+        </w:rPr>
+        <w:t xml:space="preserve">Headline: </w:t>
+      </w:r>
+      <w:r>
+        <w:t>As good as it gets at your size</w:t>
+      </w:r>
+    </w:p>
+    <w:p>
+      <w:r>
+        <w:rPr>
+          <w:b/>
+        </w:rPr>
+        <w:t xml:space="preserve">Description: </w:t>
+      </w:r>
+      <w:r>
+        <w:t>The fundamentals here are as strong as I see them. Scale is the only thing holding the multiple down, because the buyers who pay the highest multiples do not look below a few million in turnover. Growth is worth more to your final number now than any further tidying up, and you already have the machine to grow with.</w:t>
+      </w:r>
+    </w:p>
+    <w:p>
+      <w:pPr>
+        <w:keepNext/>
+        <w:spacing w:before="200" w:after="80"/>
+      </w:pPr>
+      <w:r>
+        <w:rPr>
+          <w:rFonts w:ascii="Arial" w:hAnsi="Arial"/>
+          <w:b/>
+          <w:color w:val="0F172A"/>
+          <w:sz w:val="22"/>
+        </w:rPr>
+        <w:t>The Roadmap:</w:t>
+      </w:r>
+    </w:p>
+    <w:p>
+      <w:pPr>
+        <w:pStyle w:val="ListBullet"/>
+      </w:pPr>
+      <w:r>
+        <w:rPr>
+          <w:b/>
+        </w:rPr>
+        <w:t xml:space="preserve">Step 1: </w:t>
+      </w:r>
+      <w:r>
+        <w:t>Put everything into growth for the next two years, since the fundamentals are already right.</w:t>
+      </w:r>
+    </w:p>
+    <w:p>
+      <w:pPr>
+        <w:pStyle w:val="ListBullet"/>
+      </w:pPr>
+      <w:r>
+        <w:rPr>
+          <w:b/>
+        </w:rPr>
+        <w:t xml:space="preserve">Step 2: </w:t>
+      </w:r>
+      <w:r>
+        <w:t>Keep the recurring revenue percentage climbing whilst you scale.</w:t>
+      </w:r>
+    </w:p>
+    <w:p>
+      <w:pPr>
+        <w:pStyle w:val="ListBullet"/>
+      </w:pPr>
+      <w:r>
+        <w:rPr>
+          <w:b/>
+        </w:rPr>
+        <w:t xml:space="preserve">Step 3: </w:t>
+      </w:r>
+      <w:r>
+        <w:t>Revisit this diagnostic when you cross three million, because the ceiling on your multiple moves at that point.</w:t>
       </w:r>
     </w:p>
     <w:p/>
@@ -2558,9 +3054,9 @@
           <w:rFonts w:ascii="Arial" w:hAnsi="Arial"/>
           <w:b/>
           <w:color w:val="2ABAD2"/>
-          <w:sz w:val="32"/>
+          <w:sz w:val="30"/>
         </w:rPr>
-        <w:t>6. Unfiltered Advisory Call &amp; Accelerator CTAs</w:t>
+        <w:t>6. Where Each Result Leads (Call to Action Routing)</w:t>
       </w:r>
     </w:p>
     <w:tbl>
@@ -2592,25 +3088,41 @@
               <w:rPr>
                 <w:b/>
                 <w:color w:val="0F172A"/>
-                <w:sz w:val="22"/>
+                <w:sz w:val="21"/>
               </w:rPr>
-              <w:t>Closing High-Converting Call to Action:</w:t>
+              <w:t>Conversion Routing Logic:</w:t>
               <w:br/>
             </w:r>
             <w:r>
               <w:rPr>
                 <w:color w:val="0F172A"/>
-                <w:sz w:val="21"/>
+                <w:sz w:val="20"/>
               </w:rPr>
-              <w:t>Headline: 'This Is What’s Standing Between Where You Are Now and a Premium Exit.'</w:t>
+              <w:t>ROUTING RULES:</w:t>
+              <w:br/>
+              <w:t>• Q16 = inside twelve months (any tier) OR Tier 3/4 ➔ Route to Call</w:t>
+              <w:br/>
+              <w:t>• Tier 1 or Tier 2 (exit &gt; 12 months out) ➔ Route to Accelerator</w:t>
+              <w:br/>
+              <w:t>• Broken Economics ➔ Route to Accelerator</w:t>
               <w:br/>
               <w:br/>
-              <w:t>Body: 'If you want the unfiltered version — book thirty minutes with me. No sales pitch, no generic advice, just your numbers, your primary value killer, and a battle-tested roadmap to capture your £ valuation gap.'</w:t>
+              <w:t>CTA FOR THE CALL:</w:t>
+              <w:br/>
+              <w:t>Headline: Thirty minutes, your numbers, no pitch.</w:t>
+              <w:br/>
+              <w:t>Body: If you want the unvarnished version, book half an hour with me and bring your figures. We will go through what is costing you the most, what it is worth in pounds, and the order I would fix it in if this were my business. No sales pitch and no generic advice, because neither of us has time for it.</w:t>
+              <w:br/>
+              <w:t>Button: Book your thirty minute review with Gary</w:t>
               <w:br/>
               <w:br/>
-              <w:t>Primary Action Button: Book 30-Min Unfiltered Valuation Review With Gary →</w:t>
+              <w:t>CTA FOR THE ACCELERATOR:</w:t>
               <w:br/>
-              <w:t>Secondary Link: Join Gary's Business Accelerator (£/mo): https://garyashworth.com/business-accelerator</w:t>
+              <w:t>Headline: The work comes before the exit.</w:t>
+              <w:br/>
+              <w:t>Body: Your score says the job right now is building the thing a buyer would want, and that is months of work rather than a phone call. The Accelerator is where I take owners through it, in order, using the same checklist I run over any business before I buy it.</w:t>
+              <w:br/>
+              <w:t>Button: Join the Business Accelerator</w:t>
             </w:r>
           </w:p>
         </w:tc>

</xml_diff>

<commit_message>
Update branding pill, duration badge (2-3 min), and subheadline copy
</commit_message>
<xml_diff>
--- a/Business_Sellability_Assessment_Master_Architecture.docx
+++ b/Business_Sellability_Assessment_Master_Architecture.docx
@@ -13,7 +13,7 @@
           <w:color w:val="0F172A"/>
           <w:sz w:val="44"/>
         </w:rPr>
-        <w:t>BUSINESS SELLABILITY DIAGNOSTIC</w:t>
+        <w:t>GARY ASHWORTH'S BUSINESS SELLABILITY ASSESSMENT</w:t>
       </w:r>
     </w:p>
     <w:p>
@@ -200,7 +200,7 @@
         <w:t xml:space="preserve">Subheadline: </w:t>
       </w:r>
       <w:r>
-        <w:t>Answer sixteen questions and I will show you the number, the multiple your business earns today, and the one thing doing the most damage to your price.</w:t>
+        <w:t>Answer sixteen questions and I will show you the number, the multiple your business earns today, and the one thing doing the most damage to your price. Includes tailored recommendations</w:t>
       </w:r>
     </w:p>
     <w:p>
@@ -211,7 +211,7 @@
         <w:t xml:space="preserve">Duration Badge: </w:t>
       </w:r>
       <w:r>
-        <w:t>About four minutes. No jargon.</w:t>
+        <w:t>2–3 minutes to complete</w:t>
       </w:r>
     </w:p>
     <w:p>

</xml_diff>

<commit_message>
Enforce Oxford comma consistency across all questions, options, copy, and documentation
</commit_message>
<xml_diff>
--- a/Business_Sellability_Assessment_Master_Architecture.docx
+++ b/Business_Sellability_Assessment_Master_Architecture.docx
@@ -215,28 +215,6 @@
       </w:r>
     </w:p>
     <w:p>
-      <w:r>
-        <w:rPr>
-          <w:b/>
-        </w:rPr>
-        <w:t xml:space="preserve">Credibility Block: </w:t>
-      </w:r>
-      <w:r>
-        <w:t>Forty years of buying, building and selling businesses. Thirty of them, give or take, and a fair few lessons I paid for the hard way.</w:t>
-      </w:r>
-    </w:p>
-    <w:p>
-      <w:r>
-        <w:rPr>
-          <w:b/>
-        </w:rPr>
-        <w:t xml:space="preserve">Secondary Credibility Block (Results Page / Under the fold): </w:t>
-      </w:r>
-      <w:r>
-        <w:t>"I assumed my tech recruitment business would sell for eight to ten times EBITDA, because that is what the sector had always achieved. By the time I came to sell, the going rate was five. Nobody had told me the market had moved, and that gap cost me millions. This diagnostic exists so it does not happen to you."</w:t>
-      </w:r>
-    </w:p>
-    <w:p>
       <w:pPr>
         <w:keepNext/>
         <w:spacing w:before="280" w:after="120"/>
@@ -276,7 +254,7 @@
         <w:t xml:space="preserve">Your biggest value killer: </w:t>
       </w:r>
       <w:r>
-        <w:t>The single risk taking the most money off your price, named and costed.</w:t>
+        <w:t>The single risk taking the most money off your price, named, and costed.</w:t>
       </w:r>
     </w:p>
     <w:p>

</xml_diff>

<commit_message>
Direct 30-min review call CTA to Gary's Cal.eu booking link
</commit_message>
<xml_diff>
--- a/Business_Sellability_Assessment_Master_Architecture.docx
+++ b/Business_Sellability_Assessment_Master_Architecture.docx
@@ -3091,7 +3091,7 @@
               <w:br/>
               <w:t>Body: If you want the unvarnished version, book half an hour with me and bring your figures. We will go through what is costing you the most, what it is worth in pounds, and the order I would fix it in if this were my business. No sales pitch and no generic advice, because neither of us has time for it.</w:t>
               <w:br/>
-              <w:t>Button: Book your thirty minute review with Gary</w:t>
+              <w:t>Button: Book your thirty minute review with Gary (Link: https://www.cal.eu/garyashworth/advisory-30-min?overlayCalendar=true)</w:t>
               <w:br/>
               <w:br/>
               <w:t>CTA FOR THE ACCELERATOR:</w:t>
@@ -3100,7 +3100,7 @@
               <w:br/>
               <w:t>Body: Your score says the job right now is building the thing a buyer would want, and that is months of work rather than a phone call. The Accelerator is where I take owners through it, in order, using the same checklist I run over any business before I buy it.</w:t>
               <w:br/>
-              <w:t>Button: Join the Business Accelerator</w:t>
+              <w:t>Button: Join the Business Accelerator (Link: https://garyashworth.com/business-accelerator)</w:t>
             </w:r>
           </w:p>
         </w:tc>

</xml_diff>

<commit_message>
Update Advisory Call headline, body (pounds/dollars), and remove generic advice phrase
</commit_message>
<xml_diff>
--- a/Business_Sellability_Assessment_Master_Architecture.docx
+++ b/Business_Sellability_Assessment_Master_Architecture.docx
@@ -3087,9 +3087,9 @@
               <w:br/>
               <w:t>CTA FOR THE CALL:</w:t>
               <w:br/>
-              <w:t>Headline: Thirty minutes, your numbers, no pitch.</w:t>
+              <w:t>Headline: Next Step: Book a 1:1 Private Advisory Call</w:t>
               <w:br/>
-              <w:t>Body: If you want the unvarnished version, book half an hour with me and bring your figures. We will go through what is costing you the most, what it is worth in pounds, and the order I would fix it in if this were my business. No sales pitch and no generic advice, because neither of us has time for it.</w:t>
+              <w:t>Body: If you want the unvarnished version, book half an hour with me and bring your figures. We will go through what is costing you the most, what it is worth in pounds/dollars, and the order I would fix it in if this were my business.</w:t>
               <w:br/>
               <w:t>Button: Book your thirty minute review with Gary (Link: https://www.cal.eu/garyashworth/advisory-30-min?overlayCalendar=true)</w:t>
               <w:br/>

</xml_diff>

<commit_message>
Route all assessment respondents exclusively to the 30-minute private advisory call
</commit_message>
<xml_diff>
--- a/Business_Sellability_Assessment_Master_Architecture.docx
+++ b/Business_Sellability_Assessment_Master_Architecture.docx
@@ -3068,7 +3068,7 @@
                 <w:color w:val="0F172A"/>
                 <w:sz w:val="21"/>
               </w:rPr>
-              <w:t>Conversion Routing Logic:</w:t>
+              <w:t>Conversion Action (All Cases):</w:t>
               <w:br/>
             </w:r>
             <w:r>
@@ -3076,31 +3076,18 @@
                 <w:color w:val="0F172A"/>
                 <w:sz w:val="20"/>
               </w:rPr>
-              <w:t>ROUTING RULES:</w:t>
+              <w:t>ROUTING RULE:</w:t>
               <w:br/>
-              <w:t>• Q16 = inside twelve months (any tier) OR Tier 3/4 ➔ Route to Call</w:t>
-              <w:br/>
-              <w:t>• Tier 1 or Tier 2 (exit &gt; 12 months out) ➔ Route to Accelerator</w:t>
-              <w:br/>
-              <w:t>• Broken Economics ➔ Route to Accelerator</w:t>
+              <w:t>• All respondents across all tiers and scenarios are directed to the 30-minute private advisory call.</w:t>
               <w:br/>
               <w:br/>
-              <w:t>CTA FOR THE CALL:</w:t>
+              <w:t>CTA FOR THE PRIVATE ADVISORY CALL:</w:t>
               <w:br/>
               <w:t>Headline: Next Step: Book a 1:1 Private Advisory Call</w:t>
               <w:br/>
               <w:t>Body: If you want the unvarnished version, book half an hour with me and bring your figures. We will go through what is costing you the most, what it is worth in pounds/dollars, and the order I would fix it in if this were my business.</w:t>
               <w:br/>
               <w:t>Button: Book your thirty minute review with Gary (Link: https://www.cal.eu/garyashworth/advisory-30-min?overlayCalendar=true)</w:t>
-              <w:br/>
-              <w:br/>
-              <w:t>CTA FOR THE ACCELERATOR:</w:t>
-              <w:br/>
-              <w:t>Headline: The work comes before the exit.</w:t>
-              <w:br/>
-              <w:t>Body: Your score says the job right now is building the thing a buyer would want, and that is months of work rather than a phone call. The Accelerator is where I take owners through it, in order, using the same checklist I run over any business before I buy it.</w:t>
-              <w:br/>
-              <w:t>Button: Join the Business Accelerator (Link: https://garyashworth.com/business-accelerator)</w:t>
             </w:r>
           </w:p>
         </w:tc>

</xml_diff>

<commit_message>
Update assessment branding to Tool, EBITDA subtitle on Q2, recurring title on Q10, and add serverless lead capture integration
</commit_message>
<xml_diff>
--- a/Business_Sellability_Assessment_Master_Architecture.docx
+++ b/Business_Sellability_Assessment_Master_Architecture.docx
@@ -189,7 +189,7 @@
         <w:t xml:space="preserve">Headline: </w:t>
       </w:r>
       <w:r>
-        <w:t>If you put your business on the market next Monday, what would a buyer really pay for it?</w:t>
+        <w:t>If you put your business on the market today, what would a buyer really pay for it?</w:t>
       </w:r>
     </w:p>
     <w:p>
@@ -200,7 +200,7 @@
         <w:t xml:space="preserve">Subheadline: </w:t>
       </w:r>
       <w:r>
-        <w:t>Answer sixteen questions and I will show you the number, the multiple your business earns today, and the one thing doing the most damage to your price. Includes tailored recommendations</w:t>
+        <w:t>Answer sixteen questions and I will show you an estimated value and multiple your business is worth today, plus the one thing doing the most damage to your price. Includes tailored recommendations.</w:t>
       </w:r>
     </w:p>
     <w:p>
@@ -321,7 +321,7 @@
         <w:t xml:space="preserve">Button copy: </w:t>
       </w:r>
       <w:r>
-        <w:t>Start the diagnostic</w:t>
+        <w:t>Start the assessment</w:t>
       </w:r>
     </w:p>
     <w:p>
@@ -446,7 +446,7 @@
           <w:color w:val="0F172A"/>
           <w:sz w:val="22"/>
         </w:rPr>
-        <w:t>Q2. What is your net profit margin before your own salary, interest and tax?</w:t>
+        <w:t>Q2. What is your net profit margin before your own salary, interest, and tax?</w:t>
       </w:r>
     </w:p>
     <w:p>
@@ -455,7 +455,7 @@
           <w:i/>
           <w:color w:val="64748B"/>
         </w:rPr>
-        <w:t>Context: This is the number buyers price off. Turnover is what you tell people at dinner, margin is what somebody buys.</w:t>
+        <w:t>Context: This is your Adjusted EBITDA margin—the underlying earnings figure buyers price off. Turnover is for dinner conversation; margin is what somebody buys.</w:t>
       </w:r>
     </w:p>
     <w:p>
@@ -629,7 +629,7 @@
         <w:t xml:space="preserve">Going backwards </w:t>
       </w:r>
       <w:r>
-        <w:t>(0 pts, caps final score at 55)</w:t>
+        <w:t>(0 pts, caps score at 55)</w:t>
       </w:r>
     </w:p>
     <w:p>
@@ -804,7 +804,7 @@
         <w:t xml:space="preserve">They stop </w:t>
       </w:r>
       <w:r>
-        <w:t>(0 pts, sets Owner Dependent flag)</w:t>
+        <w:t>(0 pts, flags owner-dependent)</w:t>
       </w:r>
     </w:p>
     <w:p>
@@ -1196,7 +1196,7 @@
           <w:color w:val="0F172A"/>
           <w:sz w:val="22"/>
         </w:rPr>
-        <w:t>Q8B (conditional). Is that single source something you own or control, such as an exclusive licence, a patent or an agreement nobody else can get?</w:t>
+        <w:t>Q8B (conditional). Is that single source something you own or control, such as an exclusive licence, a patent, or an agreement nobody else can get?</w:t>
       </w:r>
     </w:p>
     <w:p>
@@ -1343,7 +1343,7 @@
           <w:color w:val="0F172A"/>
           <w:sz w:val="22"/>
         </w:rPr>
-        <w:t>Q10. How much of your revenue is on subscription or contract?</w:t>
+        <w:t>Q10. How much of your revenue is recurring or contracted?</w:t>
       </w:r>
     </w:p>
     <w:p>

</xml_diff>